<commit_message>
Hoan thieu bai thuc hành CTDL va GT - 2026-10-09
</commit_message>
<xml_diff>
--- a/N24DCDT103_NguyenQuangTruong_chuong5_1Tuan6/Chuong5_Mau_bao_cao_lap_trinh.docx
+++ b/N24DCDT103_NguyenQuangTruong_chuong5_1Tuan6/Chuong5_Mau_bao_cao_lap_trinh.docx
@@ -14,25 +14,7 @@
           <w:color w:val="auto"/>
           <w:sz w:val="18"/>
         </w:rPr>
-        <w:t xml:space="preserve">BÁO CÁO THỰC </w:t>
-      </w:r>
-      <w:proofErr w:type="gramStart"/>
-      <w:r>
-        <w:rPr>
-          <w:b/>
-          <w:color w:val="auto"/>
-          <w:sz w:val="18"/>
-        </w:rPr>
-        <w:t>HÀNH  /</w:t>
-      </w:r>
-      <w:proofErr w:type="gramEnd"/>
-      <w:r>
-        <w:rPr>
-          <w:b/>
-          <w:color w:val="auto"/>
-          <w:sz w:val="18"/>
-        </w:rPr>
-        <w:t xml:space="preserve">  7 NGÀY</w:t>
+        <w:t>BÁO CÁO THỰC HÀNH  /  7 NGÀY</w:t>
       </w:r>
     </w:p>
     <w:p>
@@ -42,75 +24,11 @@
           <w:color w:val="auto"/>
         </w:rPr>
       </w:pPr>
-      <w:proofErr w:type="spellStart"/>
       <w:r>
         <w:rPr>
           <w:color w:val="auto"/>
         </w:rPr>
-        <w:t>Bài</w:t>
-      </w:r>
-      <w:proofErr w:type="spellEnd"/>
-      <w:r>
-        <w:rPr>
-          <w:color w:val="auto"/>
-        </w:rPr>
-        <w:t xml:space="preserve"> </w:t>
-      </w:r>
-      <w:proofErr w:type="spellStart"/>
-      <w:r>
-        <w:rPr>
-          <w:color w:val="auto"/>
-        </w:rPr>
-        <w:t>tập</w:t>
-      </w:r>
-      <w:proofErr w:type="spellEnd"/>
-      <w:r>
-        <w:rPr>
-          <w:color w:val="auto"/>
-        </w:rPr>
-        <w:t xml:space="preserve"> </w:t>
-      </w:r>
-      <w:proofErr w:type="spellStart"/>
-      <w:r>
-        <w:rPr>
-          <w:color w:val="auto"/>
-        </w:rPr>
-        <w:t>lập</w:t>
-      </w:r>
-      <w:proofErr w:type="spellEnd"/>
-      <w:r>
-        <w:rPr>
-          <w:color w:val="auto"/>
-        </w:rPr>
-        <w:t xml:space="preserve"> </w:t>
-      </w:r>
-      <w:proofErr w:type="spellStart"/>
-      <w:r>
-        <w:rPr>
-          <w:color w:val="auto"/>
-        </w:rPr>
-        <w:t>trình</w:t>
-      </w:r>
-      <w:proofErr w:type="spellEnd"/>
-      <w:r>
-        <w:rPr>
-          <w:color w:val="auto"/>
-        </w:rPr>
-        <w:t xml:space="preserve"> </w:t>
-      </w:r>
-      <w:proofErr w:type="spellStart"/>
-      <w:r>
-        <w:rPr>
-          <w:color w:val="auto"/>
-        </w:rPr>
-        <w:t>Chương</w:t>
-      </w:r>
-      <w:proofErr w:type="spellEnd"/>
-      <w:r>
-        <w:rPr>
-          <w:color w:val="auto"/>
-        </w:rPr>
-        <w:t xml:space="preserve"> 5</w:t>
+        <w:t>Bài tập lập trình Chương 5</w:t>
       </w:r>
     </w:p>
     <w:p>
@@ -120,33 +38,11 @@
           <w:lang w:val="vi-VN"/>
         </w:rPr>
       </w:pPr>
-      <w:proofErr w:type="spellStart"/>
       <w:r>
         <w:rPr>
           <w:color w:val="auto"/>
         </w:rPr>
-        <w:t>Họ</w:t>
-      </w:r>
-      <w:proofErr w:type="spellEnd"/>
-      <w:r>
-        <w:rPr>
-          <w:color w:val="auto"/>
-        </w:rPr>
-        <w:t xml:space="preserve"> </w:t>
-      </w:r>
-      <w:proofErr w:type="spellStart"/>
-      <w:r>
-        <w:rPr>
-          <w:color w:val="auto"/>
-        </w:rPr>
-        <w:t>tên</w:t>
-      </w:r>
-      <w:proofErr w:type="spellEnd"/>
-      <w:r>
-        <w:rPr>
-          <w:color w:val="auto"/>
-        </w:rPr>
-        <w:t xml:space="preserve">: </w:t>
+        <w:t xml:space="preserve">Họ tên: </w:t>
       </w:r>
       <w:r>
         <w:rPr>
@@ -159,64 +55,26 @@
           <w:color w:val="auto"/>
           <w:lang w:val="vi-VN"/>
         </w:rPr>
-        <w:t xml:space="preserve"> Quang </w:t>
-      </w:r>
-      <w:proofErr w:type="gramStart"/>
-      <w:r>
-        <w:rPr>
-          <w:color w:val="auto"/>
-          <w:lang w:val="vi-VN"/>
-        </w:rPr>
-        <w:t>Trường</w:t>
+        <w:t xml:space="preserve"> Quang Trường</w:t>
       </w:r>
       <w:r>
         <w:rPr>
           <w:color w:val="auto"/>
         </w:rPr>
-        <w:t xml:space="preserve">  MSSV</w:t>
-      </w:r>
-      <w:proofErr w:type="gramEnd"/>
-      <w:r>
-        <w:rPr>
-          <w:color w:val="auto"/>
-        </w:rPr>
-        <w:t>:</w:t>
+        <w:t xml:space="preserve">  MSSV:</w:t>
       </w:r>
       <w:r>
         <w:rPr>
           <w:color w:val="auto"/>
           <w:lang w:val="vi-VN"/>
         </w:rPr>
-        <w:t xml:space="preserve"> N24DCDT</w:t>
-      </w:r>
-      <w:proofErr w:type="gramStart"/>
-      <w:r>
-        <w:rPr>
-          <w:color w:val="auto"/>
-          <w:lang w:val="vi-VN"/>
-        </w:rPr>
-        <w:t>103</w:t>
+        <w:t xml:space="preserve"> N24DCDT103</w:t>
       </w:r>
       <w:r>
         <w:rPr>
           <w:color w:val="auto"/>
         </w:rPr>
-        <w:t xml:space="preserve">  </w:t>
-      </w:r>
-      <w:proofErr w:type="spellStart"/>
-      <w:r>
-        <w:rPr>
-          <w:color w:val="auto"/>
-        </w:rPr>
-        <w:t>Lớp</w:t>
-      </w:r>
-      <w:proofErr w:type="spellEnd"/>
-      <w:proofErr w:type="gramEnd"/>
-      <w:r>
-        <w:rPr>
-          <w:color w:val="auto"/>
-        </w:rPr>
-        <w:t xml:space="preserve">: </w:t>
+        <w:t xml:space="preserve">  Lớp: </w:t>
       </w:r>
       <w:r>
         <w:rPr>
@@ -357,44 +215,8 @@
         <w:rPr>
           <w:color w:val="auto"/>
         </w:rPr>
-        <w:t xml:space="preserve">1. </w:t>
+        <w:t>1. Chạy chương trình</w:t>
       </w:r>
-      <w:proofErr w:type="spellStart"/>
-      <w:r>
-        <w:rPr>
-          <w:color w:val="auto"/>
-        </w:rPr>
-        <w:t>Chạy</w:t>
-      </w:r>
-      <w:proofErr w:type="spellEnd"/>
-      <w:r>
-        <w:rPr>
-          <w:color w:val="auto"/>
-        </w:rPr>
-        <w:t xml:space="preserve"> </w:t>
-      </w:r>
-      <w:proofErr w:type="spellStart"/>
-      <w:r>
-        <w:rPr>
-          <w:color w:val="auto"/>
-        </w:rPr>
-        <w:t>chương</w:t>
-      </w:r>
-      <w:proofErr w:type="spellEnd"/>
-      <w:r>
-        <w:rPr>
-          <w:color w:val="auto"/>
-        </w:rPr>
-        <w:t xml:space="preserve"> </w:t>
-      </w:r>
-      <w:proofErr w:type="spellStart"/>
-      <w:r>
-        <w:rPr>
-          <w:color w:val="auto"/>
-        </w:rPr>
-        <w:t>trình</w:t>
-      </w:r>
-      <w:proofErr w:type="spellEnd"/>
     </w:p>
     <w:p>
       <w:pPr>
@@ -402,425 +224,11 @@
           <w:color w:val="auto"/>
         </w:rPr>
       </w:pPr>
-      <w:proofErr w:type="spellStart"/>
       <w:r>
         <w:rPr>
           <w:color w:val="auto"/>
         </w:rPr>
-        <w:t>Ghi</w:t>
-      </w:r>
-      <w:proofErr w:type="spellEnd"/>
-      <w:r>
-        <w:rPr>
-          <w:color w:val="auto"/>
-        </w:rPr>
-        <w:t xml:space="preserve"> </w:t>
-      </w:r>
-      <w:proofErr w:type="spellStart"/>
-      <w:r>
-        <w:rPr>
-          <w:color w:val="auto"/>
-        </w:rPr>
-        <w:t>lệnh</w:t>
-      </w:r>
-      <w:proofErr w:type="spellEnd"/>
-      <w:r>
-        <w:rPr>
-          <w:color w:val="auto"/>
-        </w:rPr>
-        <w:t xml:space="preserve"> </w:t>
-      </w:r>
-      <w:proofErr w:type="spellStart"/>
-      <w:r>
-        <w:rPr>
-          <w:color w:val="auto"/>
-        </w:rPr>
-        <w:t>đã</w:t>
-      </w:r>
-      <w:proofErr w:type="spellEnd"/>
-      <w:r>
-        <w:rPr>
-          <w:color w:val="auto"/>
-        </w:rPr>
-        <w:t xml:space="preserve"> </w:t>
-      </w:r>
-      <w:proofErr w:type="spellStart"/>
-      <w:r>
-        <w:rPr>
-          <w:color w:val="auto"/>
-        </w:rPr>
-        <w:t>dùng</w:t>
-      </w:r>
-      <w:proofErr w:type="spellEnd"/>
-      <w:r>
-        <w:rPr>
-          <w:color w:val="auto"/>
-        </w:rPr>
-        <w:t xml:space="preserve"> </w:t>
-      </w:r>
-      <w:proofErr w:type="spellStart"/>
-      <w:r>
-        <w:rPr>
-          <w:color w:val="auto"/>
-        </w:rPr>
-        <w:t>và</w:t>
-      </w:r>
-      <w:proofErr w:type="spellEnd"/>
-      <w:r>
-        <w:rPr>
-          <w:color w:val="auto"/>
-        </w:rPr>
-        <w:t xml:space="preserve"> </w:t>
-      </w:r>
-      <w:proofErr w:type="spellStart"/>
-      <w:r>
-        <w:rPr>
-          <w:color w:val="auto"/>
-        </w:rPr>
-        <w:t>kết</w:t>
-      </w:r>
-      <w:proofErr w:type="spellEnd"/>
-      <w:r>
-        <w:rPr>
-          <w:color w:val="auto"/>
-        </w:rPr>
-        <w:t xml:space="preserve"> </w:t>
-      </w:r>
-      <w:proofErr w:type="spellStart"/>
-      <w:r>
-        <w:rPr>
-          <w:color w:val="auto"/>
-        </w:rPr>
-        <w:t>quả</w:t>
-      </w:r>
-      <w:proofErr w:type="spellEnd"/>
-      <w:r>
-        <w:rPr>
-          <w:color w:val="auto"/>
-        </w:rPr>
-        <w:t xml:space="preserve"> </w:t>
-      </w:r>
-      <w:proofErr w:type="spellStart"/>
-      <w:r>
-        <w:rPr>
-          <w:color w:val="auto"/>
-        </w:rPr>
-        <w:t>thực</w:t>
-      </w:r>
-      <w:proofErr w:type="spellEnd"/>
-      <w:r>
-        <w:rPr>
-          <w:color w:val="auto"/>
-        </w:rPr>
-        <w:t xml:space="preserve"> </w:t>
-      </w:r>
-      <w:proofErr w:type="spellStart"/>
-      <w:r>
-        <w:rPr>
-          <w:color w:val="auto"/>
-        </w:rPr>
-        <w:t>tế</w:t>
-      </w:r>
-      <w:proofErr w:type="spellEnd"/>
-      <w:r>
-        <w:rPr>
-          <w:color w:val="auto"/>
-        </w:rPr>
-        <w:t xml:space="preserve">. </w:t>
-      </w:r>
-      <w:proofErr w:type="spellStart"/>
-      <w:r>
-        <w:rPr>
-          <w:color w:val="auto"/>
-        </w:rPr>
-        <w:t>Nếu</w:t>
-      </w:r>
-      <w:proofErr w:type="spellEnd"/>
-      <w:r>
-        <w:rPr>
-          <w:color w:val="auto"/>
-        </w:rPr>
-        <w:t xml:space="preserve"> </w:t>
-      </w:r>
-      <w:proofErr w:type="spellStart"/>
-      <w:r>
-        <w:rPr>
-          <w:color w:val="auto"/>
-        </w:rPr>
-        <w:t>gặp</w:t>
-      </w:r>
-      <w:proofErr w:type="spellEnd"/>
-      <w:r>
-        <w:rPr>
-          <w:color w:val="auto"/>
-        </w:rPr>
-        <w:t xml:space="preserve"> </w:t>
-      </w:r>
-      <w:proofErr w:type="spellStart"/>
-      <w:r>
-        <w:rPr>
-          <w:color w:val="auto"/>
-        </w:rPr>
-        <w:t>lỗi</w:t>
-      </w:r>
-      <w:proofErr w:type="spellEnd"/>
-      <w:r>
-        <w:rPr>
-          <w:color w:val="auto"/>
-        </w:rPr>
-        <w:t xml:space="preserve"> </w:t>
-      </w:r>
-      <w:proofErr w:type="spellStart"/>
-      <w:r>
-        <w:rPr>
-          <w:color w:val="auto"/>
-        </w:rPr>
-        <w:t>cài</w:t>
-      </w:r>
-      <w:proofErr w:type="spellEnd"/>
-      <w:r>
-        <w:rPr>
-          <w:color w:val="auto"/>
-        </w:rPr>
-        <w:t xml:space="preserve"> </w:t>
-      </w:r>
-      <w:proofErr w:type="spellStart"/>
-      <w:r>
-        <w:rPr>
-          <w:color w:val="auto"/>
-        </w:rPr>
-        <w:t>đặt</w:t>
-      </w:r>
-      <w:proofErr w:type="spellEnd"/>
-      <w:r>
-        <w:rPr>
-          <w:color w:val="auto"/>
-        </w:rPr>
-        <w:t xml:space="preserve"> </w:t>
-      </w:r>
-      <w:proofErr w:type="spellStart"/>
-      <w:r>
-        <w:rPr>
-          <w:color w:val="auto"/>
-        </w:rPr>
-        <w:t>hoặc</w:t>
-      </w:r>
-      <w:proofErr w:type="spellEnd"/>
-      <w:r>
-        <w:rPr>
-          <w:color w:val="auto"/>
-        </w:rPr>
-        <w:t xml:space="preserve"> </w:t>
-      </w:r>
-      <w:proofErr w:type="spellStart"/>
-      <w:r>
-        <w:rPr>
-          <w:color w:val="auto"/>
-        </w:rPr>
-        <w:t>chạy</w:t>
-      </w:r>
-      <w:proofErr w:type="spellEnd"/>
-      <w:r>
-        <w:rPr>
-          <w:color w:val="auto"/>
-        </w:rPr>
-        <w:t xml:space="preserve"> </w:t>
-      </w:r>
-      <w:proofErr w:type="spellStart"/>
-      <w:r>
-        <w:rPr>
-          <w:color w:val="auto"/>
-        </w:rPr>
-        <w:t>mã</w:t>
-      </w:r>
-      <w:proofErr w:type="spellEnd"/>
-      <w:r>
-        <w:rPr>
-          <w:color w:val="auto"/>
-        </w:rPr>
-        <w:t xml:space="preserve">, </w:t>
-      </w:r>
-      <w:proofErr w:type="spellStart"/>
-      <w:r>
-        <w:rPr>
-          <w:color w:val="auto"/>
-        </w:rPr>
-        <w:t>mô</w:t>
-      </w:r>
-      <w:proofErr w:type="spellEnd"/>
-      <w:r>
-        <w:rPr>
-          <w:color w:val="auto"/>
-        </w:rPr>
-        <w:t xml:space="preserve"> </w:t>
-      </w:r>
-      <w:proofErr w:type="spellStart"/>
-      <w:r>
-        <w:rPr>
-          <w:color w:val="auto"/>
-        </w:rPr>
-        <w:t>tả</w:t>
-      </w:r>
-      <w:proofErr w:type="spellEnd"/>
-      <w:r>
-        <w:rPr>
-          <w:color w:val="auto"/>
-        </w:rPr>
-        <w:t xml:space="preserve"> </w:t>
-      </w:r>
-      <w:proofErr w:type="spellStart"/>
-      <w:r>
-        <w:rPr>
-          <w:color w:val="auto"/>
-        </w:rPr>
-        <w:t>cách</w:t>
-      </w:r>
-      <w:proofErr w:type="spellEnd"/>
-      <w:r>
-        <w:rPr>
-          <w:color w:val="auto"/>
-        </w:rPr>
-        <w:t xml:space="preserve"> </w:t>
-      </w:r>
-      <w:proofErr w:type="spellStart"/>
-      <w:r>
-        <w:rPr>
-          <w:color w:val="auto"/>
-        </w:rPr>
-        <w:t>xử</w:t>
-      </w:r>
-      <w:proofErr w:type="spellEnd"/>
-      <w:r>
-        <w:rPr>
-          <w:color w:val="auto"/>
-        </w:rPr>
-        <w:t xml:space="preserve"> </w:t>
-      </w:r>
-      <w:proofErr w:type="spellStart"/>
-      <w:r>
-        <w:rPr>
-          <w:color w:val="auto"/>
-        </w:rPr>
-        <w:t>lý</w:t>
-      </w:r>
-      <w:proofErr w:type="spellEnd"/>
-      <w:r>
-        <w:rPr>
-          <w:color w:val="auto"/>
-        </w:rPr>
-        <w:t xml:space="preserve">; </w:t>
-      </w:r>
-      <w:proofErr w:type="spellStart"/>
-      <w:r>
-        <w:rPr>
-          <w:color w:val="auto"/>
-        </w:rPr>
-        <w:t>không</w:t>
-      </w:r>
-      <w:proofErr w:type="spellEnd"/>
-      <w:r>
-        <w:rPr>
-          <w:color w:val="auto"/>
-        </w:rPr>
-        <w:t xml:space="preserve"> </w:t>
-      </w:r>
-      <w:proofErr w:type="spellStart"/>
-      <w:r>
-        <w:rPr>
-          <w:color w:val="auto"/>
-        </w:rPr>
-        <w:t>ghi</w:t>
-      </w:r>
-      <w:proofErr w:type="spellEnd"/>
-      <w:r>
-        <w:rPr>
-          <w:color w:val="auto"/>
-        </w:rPr>
-        <w:t xml:space="preserve"> “</w:t>
-      </w:r>
-      <w:proofErr w:type="spellStart"/>
-      <w:r>
-        <w:rPr>
-          <w:color w:val="auto"/>
-        </w:rPr>
-        <w:t>đã</w:t>
-      </w:r>
-      <w:proofErr w:type="spellEnd"/>
-      <w:r>
-        <w:rPr>
-          <w:color w:val="auto"/>
-        </w:rPr>
-        <w:t xml:space="preserve"> </w:t>
-      </w:r>
-      <w:proofErr w:type="spellStart"/>
-      <w:r>
-        <w:rPr>
-          <w:color w:val="auto"/>
-        </w:rPr>
-        <w:t>chạy</w:t>
-      </w:r>
-      <w:proofErr w:type="spellEnd"/>
-      <w:r>
-        <w:rPr>
-          <w:color w:val="auto"/>
-        </w:rPr>
-        <w:t xml:space="preserve">” </w:t>
-      </w:r>
-      <w:proofErr w:type="spellStart"/>
-      <w:r>
-        <w:rPr>
-          <w:color w:val="auto"/>
-        </w:rPr>
-        <w:t>khi</w:t>
-      </w:r>
-      <w:proofErr w:type="spellEnd"/>
-      <w:r>
-        <w:rPr>
-          <w:color w:val="auto"/>
-        </w:rPr>
-        <w:t xml:space="preserve"> </w:t>
-      </w:r>
-      <w:proofErr w:type="spellStart"/>
-      <w:r>
-        <w:rPr>
-          <w:color w:val="auto"/>
-        </w:rPr>
-        <w:t>chưa</w:t>
-      </w:r>
-      <w:proofErr w:type="spellEnd"/>
-      <w:r>
-        <w:rPr>
-          <w:color w:val="auto"/>
-        </w:rPr>
-        <w:t xml:space="preserve"> </w:t>
-      </w:r>
-      <w:proofErr w:type="spellStart"/>
-      <w:r>
-        <w:rPr>
-          <w:color w:val="auto"/>
-        </w:rPr>
-        <w:t>thực</w:t>
-      </w:r>
-      <w:proofErr w:type="spellEnd"/>
-      <w:r>
-        <w:rPr>
-          <w:color w:val="auto"/>
-        </w:rPr>
-        <w:t xml:space="preserve"> </w:t>
-      </w:r>
-      <w:proofErr w:type="spellStart"/>
-      <w:r>
-        <w:rPr>
-          <w:color w:val="auto"/>
-        </w:rPr>
-        <w:t>hiện</w:t>
-      </w:r>
-      <w:proofErr w:type="spellEnd"/>
-      <w:r>
-        <w:rPr>
-          <w:color w:val="auto"/>
-        </w:rPr>
-        <w:t>.</w:t>
+        <w:t>Ghi lệnh đã dùng và kết quả thực tế. Nếu gặp lỗi cài đặt hoặc chạy mã, mô tả cách xử lý; không ghi “đã chạy” khi chưa thực hiện.</w:t>
       </w:r>
     </w:p>
     <w:p>
@@ -834,41 +242,13 @@
           <w:lang w:val="vi-VN"/>
         </w:rPr>
       </w:pPr>
-      <w:proofErr w:type="spellStart"/>
       <w:r>
         <w:rPr>
           <w:rFonts w:ascii="Courier New" w:hAnsi="Courier New"/>
           <w:color w:val="auto"/>
           <w:sz w:val="18"/>
         </w:rPr>
-        <w:t>Lệnh</w:t>
-      </w:r>
-      <w:proofErr w:type="spellEnd"/>
-      <w:r>
-        <w:rPr>
-          <w:rFonts w:ascii="Courier New" w:hAnsi="Courier New"/>
-          <w:color w:val="auto"/>
-          <w:sz w:val="18"/>
-        </w:rPr>
-        <w:t xml:space="preserve"> </w:t>
-      </w:r>
-      <w:proofErr w:type="spellStart"/>
-      <w:r>
-        <w:rPr>
-          <w:rFonts w:ascii="Courier New" w:hAnsi="Courier New"/>
-          <w:color w:val="auto"/>
-          <w:sz w:val="18"/>
-        </w:rPr>
-        <w:t>chạy</w:t>
-      </w:r>
-      <w:proofErr w:type="spellEnd"/>
-      <w:r>
-        <w:rPr>
-          <w:rFonts w:ascii="Courier New" w:hAnsi="Courier New"/>
-          <w:color w:val="auto"/>
-          <w:sz w:val="18"/>
-        </w:rPr>
-        <w:t xml:space="preserve">: </w:t>
+        <w:t xml:space="preserve">Lệnh chạy: </w:t>
       </w:r>
       <w:r>
         <w:rPr>
@@ -885,150 +265,15 @@
           <w:sz w:val="18"/>
         </w:rPr>
         <w:br/>
+        <w:t xml:space="preserve">Lệnh kiểm thử: </w:t>
       </w:r>
-      <w:proofErr w:type="spellStart"/>
       <w:r>
         <w:rPr>
           <w:rFonts w:ascii="Courier New" w:hAnsi="Courier New"/>
           <w:color w:val="auto"/>
           <w:sz w:val="18"/>
         </w:rPr>
-        <w:t>Lệnh</w:t>
-      </w:r>
-      <w:proofErr w:type="spellEnd"/>
-      <w:r>
-        <w:rPr>
-          <w:rFonts w:ascii="Courier New" w:hAnsi="Courier New"/>
-          <w:color w:val="auto"/>
-          <w:sz w:val="18"/>
-        </w:rPr>
-        <w:t xml:space="preserve"> </w:t>
-      </w:r>
-      <w:proofErr w:type="spellStart"/>
-      <w:r>
-        <w:rPr>
-          <w:rFonts w:ascii="Courier New" w:hAnsi="Courier New"/>
-          <w:color w:val="auto"/>
-          <w:sz w:val="18"/>
-        </w:rPr>
-        <w:t>kiểm</w:t>
-      </w:r>
-      <w:proofErr w:type="spellEnd"/>
-      <w:r>
-        <w:rPr>
-          <w:rFonts w:ascii="Courier New" w:hAnsi="Courier New"/>
-          <w:color w:val="auto"/>
-          <w:sz w:val="18"/>
-        </w:rPr>
-        <w:t xml:space="preserve"> </w:t>
-      </w:r>
-      <w:proofErr w:type="spellStart"/>
-      <w:r>
-        <w:rPr>
-          <w:rFonts w:ascii="Courier New" w:hAnsi="Courier New"/>
-          <w:color w:val="auto"/>
-          <w:sz w:val="18"/>
-        </w:rPr>
-        <w:t>thử</w:t>
-      </w:r>
-      <w:proofErr w:type="spellEnd"/>
-      <w:r>
-        <w:rPr>
-          <w:rFonts w:ascii="Courier New" w:hAnsi="Courier New"/>
-          <w:color w:val="auto"/>
-          <w:sz w:val="18"/>
-        </w:rPr>
-        <w:t xml:space="preserve">: </w:t>
-      </w:r>
-      <w:proofErr w:type="spellStart"/>
-      <w:r>
-        <w:rPr>
-          <w:rFonts w:ascii="Courier New" w:hAnsi="Courier New"/>
-          <w:color w:val="auto"/>
-          <w:sz w:val="18"/>
-        </w:rPr>
-        <w:t>dem_gia_</w:t>
-      </w:r>
-      <w:proofErr w:type="gramStart"/>
-      <w:r>
-        <w:rPr>
-          <w:rFonts w:ascii="Courier New" w:hAnsi="Courier New"/>
-          <w:color w:val="auto"/>
-          <w:sz w:val="18"/>
-        </w:rPr>
-        <w:t>tri</w:t>
-      </w:r>
-      <w:proofErr w:type="spellEnd"/>
-      <w:r>
-        <w:rPr>
-          <w:rFonts w:ascii="Courier New" w:hAnsi="Courier New"/>
-          <w:color w:val="auto"/>
-          <w:sz w:val="18"/>
-        </w:rPr>
-        <w:t>(</w:t>
-      </w:r>
-      <w:proofErr w:type="gramEnd"/>
-      <w:r>
-        <w:rPr>
-          <w:rFonts w:ascii="Courier New" w:hAnsi="Courier New"/>
-          <w:color w:val="auto"/>
-          <w:sz w:val="18"/>
-        </w:rPr>
-        <w:t xml:space="preserve">L1, 2) </w:t>
-      </w:r>
-      <w:proofErr w:type="spellStart"/>
-      <w:r>
-        <w:rPr>
-          <w:rFonts w:ascii="Courier New" w:hAnsi="Courier New"/>
-          <w:color w:val="auto"/>
-          <w:sz w:val="18"/>
-        </w:rPr>
-        <w:t>và</w:t>
-      </w:r>
-      <w:proofErr w:type="spellEnd"/>
-      <w:r>
-        <w:rPr>
-          <w:rFonts w:ascii="Courier New" w:hAnsi="Courier New"/>
-          <w:color w:val="auto"/>
-          <w:sz w:val="18"/>
-        </w:rPr>
-        <w:t xml:space="preserve"> </w:t>
-      </w:r>
-      <w:proofErr w:type="spellStart"/>
-      <w:r>
-        <w:rPr>
-          <w:rFonts w:ascii="Courier New" w:hAnsi="Courier New"/>
-          <w:color w:val="auto"/>
-          <w:sz w:val="18"/>
-        </w:rPr>
-        <w:t>dem_gia_</w:t>
-      </w:r>
-      <w:proofErr w:type="gramStart"/>
-      <w:r>
-        <w:rPr>
-          <w:rFonts w:ascii="Courier New" w:hAnsi="Courier New"/>
-          <w:color w:val="auto"/>
-          <w:sz w:val="18"/>
-        </w:rPr>
-        <w:t>tri</w:t>
-      </w:r>
-      <w:proofErr w:type="spellEnd"/>
-      <w:r>
-        <w:rPr>
-          <w:rFonts w:ascii="Courier New" w:hAnsi="Courier New"/>
-          <w:color w:val="auto"/>
-          <w:sz w:val="18"/>
-        </w:rPr>
-        <w:t>(</w:t>
-      </w:r>
-      <w:proofErr w:type="gramEnd"/>
-      <w:r>
-        <w:rPr>
-          <w:rFonts w:ascii="Courier New" w:hAnsi="Courier New"/>
-          <w:color w:val="auto"/>
-          <w:sz w:val="18"/>
-        </w:rPr>
-        <w:t>L2, 2)</w:t>
+        <w:t>dem_gia_tri(L1, 2) và dem_gia_tri(L2, 2)</w:t>
       </w:r>
       <w:r>
         <w:rPr>
@@ -1037,42 +282,7 @@
           <w:sz w:val="18"/>
         </w:rPr>
         <w:br/>
-      </w:r>
-      <w:proofErr w:type="spellStart"/>
-      <w:r>
-        <w:rPr>
-          <w:rFonts w:ascii="Courier New" w:hAnsi="Courier New"/>
-          <w:color w:val="auto"/>
-          <w:sz w:val="18"/>
-        </w:rPr>
-        <w:t>Kết</w:t>
-      </w:r>
-      <w:proofErr w:type="spellEnd"/>
-      <w:r>
-        <w:rPr>
-          <w:rFonts w:ascii="Courier New" w:hAnsi="Courier New"/>
-          <w:color w:val="auto"/>
-          <w:sz w:val="18"/>
-        </w:rPr>
-        <w:t xml:space="preserve"> </w:t>
-      </w:r>
-      <w:proofErr w:type="spellStart"/>
-      <w:r>
-        <w:rPr>
-          <w:rFonts w:ascii="Courier New" w:hAnsi="Courier New"/>
-          <w:color w:val="auto"/>
-          <w:sz w:val="18"/>
-        </w:rPr>
-        <w:t>quả</w:t>
-      </w:r>
-      <w:proofErr w:type="spellEnd"/>
-      <w:r>
-        <w:rPr>
-          <w:rFonts w:ascii="Courier New" w:hAnsi="Courier New"/>
-          <w:color w:val="auto"/>
-          <w:sz w:val="18"/>
-        </w:rPr>
-        <w:t xml:space="preserve">: </w:t>
+        <w:t xml:space="preserve">Kết quả: </w:t>
       </w:r>
     </w:p>
     <w:p>
@@ -1086,7 +296,6 @@
           <w:lang w:val="vi-VN"/>
         </w:rPr>
       </w:pPr>
-      <w:proofErr w:type="spellStart"/>
       <w:r>
         <w:rPr>
           <w:rFonts w:ascii="Courier New" w:hAnsi="Courier New"/>
@@ -1105,7 +314,6 @@
         </w:rPr>
         <w:t>ase</w:t>
       </w:r>
-      <w:proofErr w:type="spellEnd"/>
       <w:r>
         <w:rPr>
           <w:rFonts w:ascii="Courier New" w:hAnsi="Courier New"/>
@@ -1125,7 +333,6 @@
           <w:lang w:val="vi-VN"/>
         </w:rPr>
       </w:pPr>
-      <w:proofErr w:type="spellStart"/>
       <w:r>
         <w:rPr>
           <w:rFonts w:ascii="Courier New" w:hAnsi="Courier New"/>
@@ -1133,17 +340,7 @@
           <w:sz w:val="18"/>
           <w:lang w:val="vi-VN"/>
         </w:rPr>
-        <w:t>Case</w:t>
-      </w:r>
-      <w:proofErr w:type="spellEnd"/>
-      <w:r>
-        <w:rPr>
-          <w:rFonts w:ascii="Courier New" w:hAnsi="Courier New"/>
-          <w:color w:val="auto"/>
-          <w:sz w:val="18"/>
-          <w:lang w:val="vi-VN"/>
-        </w:rPr>
-        <w:t xml:space="preserve"> 2: danh sách rỗng, x = 2 nên trả về 0 </w:t>
+        <w:t xml:space="preserve">Case 2: danh sách rỗng, x = 2 nên trả về 0 </w:t>
       </w:r>
     </w:p>
     <w:p>
@@ -1199,7 +396,6 @@
                 <w:color w:val="auto"/>
               </w:rPr>
             </w:pPr>
-            <w:proofErr w:type="spellStart"/>
             <w:r>
               <w:rPr>
                 <w:b/>
@@ -1208,7 +404,6 @@
               </w:rPr>
               <w:t>Hàm</w:t>
             </w:r>
-            <w:proofErr w:type="spellEnd"/>
           </w:p>
         </w:tc>
         <w:tc>
@@ -1230,70 +425,14 @@
                 <w:color w:val="auto"/>
               </w:rPr>
             </w:pPr>
-            <w:proofErr w:type="spellStart"/>
             <w:r>
               <w:rPr>
                 <w:b/>
                 <w:color w:val="auto"/>
                 <w:sz w:val="19"/>
               </w:rPr>
-              <w:t>Tệp</w:t>
+              <w:t>Tệp và dòng mã</w:t>
             </w:r>
-            <w:proofErr w:type="spellEnd"/>
-            <w:r>
-              <w:rPr>
-                <w:b/>
-                <w:color w:val="auto"/>
-                <w:sz w:val="19"/>
-              </w:rPr>
-              <w:t xml:space="preserve"> </w:t>
-            </w:r>
-            <w:proofErr w:type="spellStart"/>
-            <w:r>
-              <w:rPr>
-                <w:b/>
-                <w:color w:val="auto"/>
-                <w:sz w:val="19"/>
-              </w:rPr>
-              <w:t>và</w:t>
-            </w:r>
-            <w:proofErr w:type="spellEnd"/>
-            <w:r>
-              <w:rPr>
-                <w:b/>
-                <w:color w:val="auto"/>
-                <w:sz w:val="19"/>
-              </w:rPr>
-              <w:t xml:space="preserve"> </w:t>
-            </w:r>
-            <w:proofErr w:type="spellStart"/>
-            <w:r>
-              <w:rPr>
-                <w:b/>
-                <w:color w:val="auto"/>
-                <w:sz w:val="19"/>
-              </w:rPr>
-              <w:t>dòng</w:t>
-            </w:r>
-            <w:proofErr w:type="spellEnd"/>
-            <w:r>
-              <w:rPr>
-                <w:b/>
-                <w:color w:val="auto"/>
-                <w:sz w:val="19"/>
-              </w:rPr>
-              <w:t xml:space="preserve"> </w:t>
-            </w:r>
-            <w:proofErr w:type="spellStart"/>
-            <w:r>
-              <w:rPr>
-                <w:b/>
-                <w:color w:val="auto"/>
-                <w:sz w:val="19"/>
-              </w:rPr>
-              <w:t>mã</w:t>
-            </w:r>
-            <w:proofErr w:type="spellEnd"/>
           </w:p>
         </w:tc>
         <w:tc>
@@ -1321,54 +460,8 @@
                 <w:color w:val="auto"/>
                 <w:sz w:val="19"/>
               </w:rPr>
-              <w:t xml:space="preserve">Hoàn </w:t>
+              <w:t>Hoàn thành / còn lỗi</w:t>
             </w:r>
-            <w:proofErr w:type="spellStart"/>
-            <w:r>
-              <w:rPr>
-                <w:b/>
-                <w:color w:val="auto"/>
-                <w:sz w:val="19"/>
-              </w:rPr>
-              <w:t>thành</w:t>
-            </w:r>
-            <w:proofErr w:type="spellEnd"/>
-            <w:r>
-              <w:rPr>
-                <w:b/>
-                <w:color w:val="auto"/>
-                <w:sz w:val="19"/>
-              </w:rPr>
-              <w:t xml:space="preserve"> / </w:t>
-            </w:r>
-            <w:proofErr w:type="spellStart"/>
-            <w:r>
-              <w:rPr>
-                <w:b/>
-                <w:color w:val="auto"/>
-                <w:sz w:val="19"/>
-              </w:rPr>
-              <w:t>còn</w:t>
-            </w:r>
-            <w:proofErr w:type="spellEnd"/>
-            <w:r>
-              <w:rPr>
-                <w:b/>
-                <w:color w:val="auto"/>
-                <w:sz w:val="19"/>
-              </w:rPr>
-              <w:t xml:space="preserve"> </w:t>
-            </w:r>
-            <w:proofErr w:type="spellStart"/>
-            <w:r>
-              <w:rPr>
-                <w:b/>
-                <w:color w:val="auto"/>
-                <w:sz w:val="19"/>
-              </w:rPr>
-              <w:t>lỗi</w:t>
-            </w:r>
-            <w:proofErr w:type="spellEnd"/>
           </w:p>
         </w:tc>
       </w:tr>
@@ -1396,7 +489,6 @@
                 <w:color w:val="auto"/>
               </w:rPr>
             </w:pPr>
-            <w:proofErr w:type="spellStart"/>
             <w:r>
               <w:rPr>
                 <w:color w:val="auto"/>
@@ -1404,7 +496,6 @@
               </w:rPr>
               <w:t>dem_gia_tri</w:t>
             </w:r>
-            <w:proofErr w:type="spellEnd"/>
           </w:p>
         </w:tc>
         <w:tc>
@@ -1515,54 +606,14 @@
                 <w:lang w:val="fr-FR"/>
               </w:rPr>
             </w:pPr>
-            <w:proofErr w:type="spellStart"/>
-            <w:proofErr w:type="gramStart"/>
             <w:r>
               <w:rPr>
                 <w:color w:val="auto"/>
                 <w:sz w:val="19"/>
                 <w:lang w:val="fr-FR"/>
               </w:rPr>
-              <w:t>xoa</w:t>
+              <w:t>xoa_tat_ca / xoa_tat_ca!</w:t>
             </w:r>
-            <w:proofErr w:type="gramEnd"/>
-            <w:r>
-              <w:rPr>
-                <w:color w:val="auto"/>
-                <w:sz w:val="19"/>
-                <w:lang w:val="fr-FR"/>
-              </w:rPr>
-              <w:t>_tat_</w:t>
-            </w:r>
-            <w:proofErr w:type="gramStart"/>
-            <w:r>
-              <w:rPr>
-                <w:color w:val="auto"/>
-                <w:sz w:val="19"/>
-                <w:lang w:val="fr-FR"/>
-              </w:rPr>
-              <w:t>ca</w:t>
-            </w:r>
-            <w:proofErr w:type="spellEnd"/>
-            <w:proofErr w:type="gramEnd"/>
-            <w:r>
-              <w:rPr>
-                <w:color w:val="auto"/>
-                <w:sz w:val="19"/>
-                <w:lang w:val="fr-FR"/>
-              </w:rPr>
-              <w:t xml:space="preserve"> / xoa_tat_</w:t>
-            </w:r>
-            <w:proofErr w:type="gramStart"/>
-            <w:r>
-              <w:rPr>
-                <w:color w:val="auto"/>
-                <w:sz w:val="19"/>
-                <w:lang w:val="fr-FR"/>
-              </w:rPr>
-              <w:t>ca!</w:t>
-            </w:r>
-            <w:proofErr w:type="gramEnd"/>
           </w:p>
         </w:tc>
         <w:tc>
@@ -1673,37 +724,12 @@
                 <w:color w:val="auto"/>
               </w:rPr>
             </w:pPr>
-            <w:proofErr w:type="spellStart"/>
             <w:r>
               <w:rPr>
                 <w:color w:val="auto"/>
                 <w:sz w:val="19"/>
               </w:rPr>
-              <w:t>lay_nhieu</w:t>
-            </w:r>
-            <w:proofErr w:type="spellEnd"/>
-            <w:r>
-              <w:rPr>
-                <w:color w:val="auto"/>
-                <w:sz w:val="19"/>
-              </w:rPr>
-              <w:t xml:space="preserve"> / </w:t>
-            </w:r>
-            <w:proofErr w:type="spellStart"/>
-            <w:r>
-              <w:rPr>
-                <w:color w:val="auto"/>
-                <w:sz w:val="19"/>
-              </w:rPr>
-              <w:t>lay_nhieu</w:t>
-            </w:r>
-            <w:proofErr w:type="spellEnd"/>
-            <w:r>
-              <w:rPr>
-                <w:color w:val="auto"/>
-                <w:sz w:val="19"/>
-              </w:rPr>
-              <w:t>!</w:t>
+              <w:t>lay_nhieu / lay_nhieu!</w:t>
             </w:r>
           </w:p>
         </w:tc>
@@ -1771,7 +797,6 @@
                 <w:lang w:val="vi-VN"/>
               </w:rPr>
             </w:pPr>
-            <w:proofErr w:type="spellStart"/>
             <w:r>
               <w:rPr>
                 <w:color w:val="auto"/>
@@ -1779,7 +804,6 @@
               </w:rPr>
               <w:t>Lỗi</w:t>
             </w:r>
-            <w:proofErr w:type="spellEnd"/>
             <w:r>
               <w:rPr>
                 <w:color w:val="auto"/>
@@ -1815,7 +839,6 @@
                 <w:color w:val="auto"/>
               </w:rPr>
             </w:pPr>
-            <w:proofErr w:type="spellStart"/>
             <w:r>
               <w:rPr>
                 <w:color w:val="auto"/>
@@ -1823,7 +846,6 @@
               </w:rPr>
               <w:t>xem_k</w:t>
             </w:r>
-            <w:proofErr w:type="spellEnd"/>
           </w:p>
         </w:tc>
         <w:tc>
@@ -1931,23 +953,7 @@
           <w:color w:val="auto"/>
           <w:lang w:val="vi-VN"/>
         </w:rPr>
-        <w:t xml:space="preserve">Lỗi ở phần lấy nhiễu em quên kiểm tra điều kiện k trước khi </w:t>
-      </w:r>
-      <w:proofErr w:type="spellStart"/>
-      <w:r>
-        <w:rPr>
-          <w:color w:val="auto"/>
-          <w:lang w:val="vi-VN"/>
-        </w:rPr>
-        <w:t>pop</w:t>
-      </w:r>
-      <w:proofErr w:type="spellEnd"/>
-      <w:r>
-        <w:rPr>
-          <w:color w:val="auto"/>
-          <w:lang w:val="vi-VN"/>
-        </w:rPr>
-        <w:t xml:space="preserve">() để vượt quá số phần tử và mất một số k, sửa bằng cách thêm kiểm tra điều kiện k </w:t>
+        <w:t xml:space="preserve">Lỗi ở phần lấy nhiễu em quên kiểm tra điều kiện k trước khi pop() để vượt quá số phần tử và mất một số k, sửa bằng cách thêm kiểm tra điều kiện k </w:t>
       </w:r>
     </w:p>
     <w:p>
@@ -1976,273 +982,7 @@
         <w:rPr>
           <w:color w:val="auto"/>
         </w:rPr>
-        <w:t xml:space="preserve">a) Khi </w:t>
-      </w:r>
-      <w:proofErr w:type="spellStart"/>
-      <w:r>
-        <w:rPr>
-          <w:color w:val="auto"/>
-        </w:rPr>
-        <w:t>xoá</w:t>
-      </w:r>
-      <w:proofErr w:type="spellEnd"/>
-      <w:r>
-        <w:rPr>
-          <w:color w:val="auto"/>
-        </w:rPr>
-        <w:t xml:space="preserve"> </w:t>
-      </w:r>
-      <w:proofErr w:type="spellStart"/>
-      <w:r>
-        <w:rPr>
-          <w:color w:val="auto"/>
-        </w:rPr>
-        <w:t>một</w:t>
-      </w:r>
-      <w:proofErr w:type="spellEnd"/>
-      <w:r>
-        <w:rPr>
-          <w:color w:val="auto"/>
-        </w:rPr>
-        <w:t xml:space="preserve"> </w:t>
-      </w:r>
-      <w:proofErr w:type="spellStart"/>
-      <w:r>
-        <w:rPr>
-          <w:color w:val="auto"/>
-        </w:rPr>
-        <w:t>nút</w:t>
-      </w:r>
-      <w:proofErr w:type="spellEnd"/>
-      <w:r>
-        <w:rPr>
-          <w:color w:val="auto"/>
-        </w:rPr>
-        <w:t xml:space="preserve">, </w:t>
-      </w:r>
-      <w:proofErr w:type="spellStart"/>
-      <w:r>
-        <w:rPr>
-          <w:color w:val="auto"/>
-        </w:rPr>
-        <w:t>biến</w:t>
-      </w:r>
-      <w:proofErr w:type="spellEnd"/>
-      <w:r>
-        <w:rPr>
-          <w:color w:val="auto"/>
-        </w:rPr>
-        <w:t xml:space="preserve"> </w:t>
-      </w:r>
-      <w:proofErr w:type="spellStart"/>
-      <w:r>
-        <w:rPr>
-          <w:color w:val="auto"/>
-        </w:rPr>
-        <w:t>truoc</w:t>
-      </w:r>
-      <w:proofErr w:type="spellEnd"/>
-      <w:r>
-        <w:rPr>
-          <w:color w:val="auto"/>
-        </w:rPr>
-        <w:t xml:space="preserve"> </w:t>
-      </w:r>
-      <w:proofErr w:type="spellStart"/>
-      <w:r>
-        <w:rPr>
-          <w:color w:val="auto"/>
-        </w:rPr>
-        <w:t>cần</w:t>
-      </w:r>
-      <w:proofErr w:type="spellEnd"/>
-      <w:r>
-        <w:rPr>
-          <w:color w:val="auto"/>
-        </w:rPr>
-        <w:t xml:space="preserve"> </w:t>
-      </w:r>
-      <w:proofErr w:type="spellStart"/>
-      <w:r>
-        <w:rPr>
-          <w:color w:val="auto"/>
-        </w:rPr>
-        <w:t>thay</w:t>
-      </w:r>
-      <w:proofErr w:type="spellEnd"/>
-      <w:r>
-        <w:rPr>
-          <w:color w:val="auto"/>
-        </w:rPr>
-        <w:t xml:space="preserve"> </w:t>
-      </w:r>
-      <w:proofErr w:type="spellStart"/>
-      <w:r>
-        <w:rPr>
-          <w:color w:val="auto"/>
-        </w:rPr>
-        <w:t>đổi</w:t>
-      </w:r>
-      <w:proofErr w:type="spellEnd"/>
-      <w:r>
-        <w:rPr>
-          <w:color w:val="auto"/>
-        </w:rPr>
-        <w:t xml:space="preserve"> </w:t>
-      </w:r>
-      <w:proofErr w:type="spellStart"/>
-      <w:r>
-        <w:rPr>
-          <w:color w:val="auto"/>
-        </w:rPr>
-        <w:t>thế</w:t>
-      </w:r>
-      <w:proofErr w:type="spellEnd"/>
-      <w:r>
-        <w:rPr>
-          <w:color w:val="auto"/>
-        </w:rPr>
-        <w:t xml:space="preserve"> </w:t>
-      </w:r>
-      <w:proofErr w:type="spellStart"/>
-      <w:r>
-        <w:rPr>
-          <w:color w:val="auto"/>
-        </w:rPr>
-        <w:t>nào</w:t>
-      </w:r>
-      <w:proofErr w:type="spellEnd"/>
-      <w:r>
-        <w:rPr>
-          <w:color w:val="auto"/>
-        </w:rPr>
-        <w:t xml:space="preserve"> </w:t>
-      </w:r>
-      <w:proofErr w:type="spellStart"/>
-      <w:r>
-        <w:rPr>
-          <w:color w:val="auto"/>
-        </w:rPr>
-        <w:t>để</w:t>
-      </w:r>
-      <w:proofErr w:type="spellEnd"/>
-      <w:r>
-        <w:rPr>
-          <w:color w:val="auto"/>
-        </w:rPr>
-        <w:t xml:space="preserve"> </w:t>
-      </w:r>
-      <w:proofErr w:type="spellStart"/>
-      <w:r>
-        <w:rPr>
-          <w:color w:val="auto"/>
-        </w:rPr>
-        <w:t>không</w:t>
-      </w:r>
-      <w:proofErr w:type="spellEnd"/>
-      <w:r>
-        <w:rPr>
-          <w:color w:val="auto"/>
-        </w:rPr>
-        <w:t xml:space="preserve"> </w:t>
-      </w:r>
-      <w:proofErr w:type="spellStart"/>
-      <w:r>
-        <w:rPr>
-          <w:color w:val="auto"/>
-        </w:rPr>
-        <w:t>bỏ</w:t>
-      </w:r>
-      <w:proofErr w:type="spellEnd"/>
-      <w:r>
-        <w:rPr>
-          <w:color w:val="auto"/>
-        </w:rPr>
-        <w:t xml:space="preserve"> </w:t>
-      </w:r>
-      <w:proofErr w:type="spellStart"/>
-      <w:r>
-        <w:rPr>
-          <w:color w:val="auto"/>
-        </w:rPr>
-        <w:t>sót</w:t>
-      </w:r>
-      <w:proofErr w:type="spellEnd"/>
-      <w:r>
-        <w:rPr>
-          <w:color w:val="auto"/>
-        </w:rPr>
-        <w:t xml:space="preserve"> </w:t>
-      </w:r>
-      <w:proofErr w:type="spellStart"/>
-      <w:r>
-        <w:rPr>
-          <w:color w:val="auto"/>
-        </w:rPr>
-        <w:t>hai</w:t>
-      </w:r>
-      <w:proofErr w:type="spellEnd"/>
-      <w:r>
-        <w:rPr>
-          <w:color w:val="auto"/>
-        </w:rPr>
-        <w:t xml:space="preserve"> </w:t>
-      </w:r>
-      <w:proofErr w:type="spellStart"/>
-      <w:r>
-        <w:rPr>
-          <w:color w:val="auto"/>
-        </w:rPr>
-        <w:t>nút</w:t>
-      </w:r>
-      <w:proofErr w:type="spellEnd"/>
-      <w:r>
-        <w:rPr>
-          <w:color w:val="auto"/>
-        </w:rPr>
-        <w:t xml:space="preserve"> </w:t>
-      </w:r>
-      <w:proofErr w:type="spellStart"/>
-      <w:r>
-        <w:rPr>
-          <w:color w:val="auto"/>
-        </w:rPr>
-        <w:t>trùng</w:t>
-      </w:r>
-      <w:proofErr w:type="spellEnd"/>
-      <w:r>
-        <w:rPr>
-          <w:color w:val="auto"/>
-        </w:rPr>
-        <w:t xml:space="preserve"> </w:t>
-      </w:r>
-      <w:proofErr w:type="spellStart"/>
-      <w:r>
-        <w:rPr>
-          <w:color w:val="auto"/>
-        </w:rPr>
-        <w:t>liên</w:t>
-      </w:r>
-      <w:proofErr w:type="spellEnd"/>
-      <w:r>
-        <w:rPr>
-          <w:color w:val="auto"/>
-        </w:rPr>
-        <w:t xml:space="preserve"> </w:t>
-      </w:r>
-      <w:proofErr w:type="spellStart"/>
-      <w:r>
-        <w:rPr>
-          <w:color w:val="auto"/>
-        </w:rPr>
-        <w:t>tiếp</w:t>
-      </w:r>
-      <w:proofErr w:type="spellEnd"/>
-      <w:r>
-        <w:rPr>
-          <w:color w:val="auto"/>
-        </w:rPr>
-        <w:t>?</w:t>
+        <w:t>a) Khi xoá một nút, biến truoc cần thay đổi thế nào để không bỏ sót hai nút trùng liên tiếp?</w:t>
       </w:r>
     </w:p>
     <w:p>
@@ -2310,159 +1050,11 @@
         </w:rPr>
         <w:t xml:space="preserve">c) Với hàng đợi đã quay vòng, vì sao không thể đọc thẳng k ô đầu của mảng? </w:t>
       </w:r>
-      <w:proofErr w:type="spellStart"/>
       <w:r>
         <w:rPr>
           <w:color w:val="auto"/>
         </w:rPr>
-        <w:t>Giải</w:t>
-      </w:r>
-      <w:proofErr w:type="spellEnd"/>
-      <w:r>
-        <w:rPr>
-          <w:color w:val="auto"/>
-        </w:rPr>
-        <w:t xml:space="preserve"> </w:t>
-      </w:r>
-      <w:proofErr w:type="spellStart"/>
-      <w:r>
-        <w:rPr>
-          <w:color w:val="auto"/>
-        </w:rPr>
-        <w:t>thích</w:t>
-      </w:r>
-      <w:proofErr w:type="spellEnd"/>
-      <w:r>
-        <w:rPr>
-          <w:color w:val="auto"/>
-        </w:rPr>
-        <w:t xml:space="preserve"> </w:t>
-      </w:r>
-      <w:proofErr w:type="spellStart"/>
-      <w:r>
-        <w:rPr>
-          <w:color w:val="auto"/>
-        </w:rPr>
-        <w:t>quy</w:t>
-      </w:r>
-      <w:proofErr w:type="spellEnd"/>
-      <w:r>
-        <w:rPr>
-          <w:color w:val="auto"/>
-        </w:rPr>
-        <w:t xml:space="preserve"> </w:t>
-      </w:r>
-      <w:proofErr w:type="spellStart"/>
-      <w:r>
-        <w:rPr>
-          <w:color w:val="auto"/>
-        </w:rPr>
-        <w:t>ước</w:t>
-      </w:r>
-      <w:proofErr w:type="spellEnd"/>
-      <w:r>
-        <w:rPr>
-          <w:color w:val="auto"/>
-        </w:rPr>
-        <w:t xml:space="preserve"> </w:t>
-      </w:r>
-      <w:proofErr w:type="spellStart"/>
-      <w:r>
-        <w:rPr>
-          <w:color w:val="auto"/>
-        </w:rPr>
-        <w:t>chỉ</w:t>
-      </w:r>
-      <w:proofErr w:type="spellEnd"/>
-      <w:r>
-        <w:rPr>
-          <w:color w:val="auto"/>
-        </w:rPr>
-        <w:t xml:space="preserve"> </w:t>
-      </w:r>
-      <w:proofErr w:type="spellStart"/>
-      <w:r>
-        <w:rPr>
-          <w:color w:val="auto"/>
-        </w:rPr>
-        <w:t>số</w:t>
-      </w:r>
-      <w:proofErr w:type="spellEnd"/>
-      <w:r>
-        <w:rPr>
-          <w:color w:val="auto"/>
-        </w:rPr>
-        <w:t xml:space="preserve"> </w:t>
-      </w:r>
-      <w:proofErr w:type="spellStart"/>
-      <w:r>
-        <w:rPr>
-          <w:color w:val="auto"/>
-        </w:rPr>
-        <w:t>trong</w:t>
-      </w:r>
-      <w:proofErr w:type="spellEnd"/>
-      <w:r>
-        <w:rPr>
-          <w:color w:val="auto"/>
-        </w:rPr>
-        <w:t xml:space="preserve"> </w:t>
-      </w:r>
-      <w:proofErr w:type="spellStart"/>
-      <w:r>
-        <w:rPr>
-          <w:color w:val="auto"/>
-        </w:rPr>
-        <w:t>ngôn</w:t>
-      </w:r>
-      <w:proofErr w:type="spellEnd"/>
-      <w:r>
-        <w:rPr>
-          <w:color w:val="auto"/>
-        </w:rPr>
-        <w:t xml:space="preserve"> </w:t>
-      </w:r>
-      <w:proofErr w:type="spellStart"/>
-      <w:r>
-        <w:rPr>
-          <w:color w:val="auto"/>
-        </w:rPr>
-        <w:t>ngữ</w:t>
-      </w:r>
-      <w:proofErr w:type="spellEnd"/>
-      <w:r>
-        <w:rPr>
-          <w:color w:val="auto"/>
-        </w:rPr>
-        <w:t xml:space="preserve"> </w:t>
-      </w:r>
-      <w:proofErr w:type="spellStart"/>
-      <w:r>
-        <w:rPr>
-          <w:color w:val="auto"/>
-        </w:rPr>
-        <w:t>đã</w:t>
-      </w:r>
-      <w:proofErr w:type="spellEnd"/>
-      <w:r>
-        <w:rPr>
-          <w:color w:val="auto"/>
-        </w:rPr>
-        <w:t xml:space="preserve"> </w:t>
-      </w:r>
-      <w:proofErr w:type="spellStart"/>
-      <w:r>
-        <w:rPr>
-          <w:color w:val="auto"/>
-        </w:rPr>
-        <w:t>chọn</w:t>
-      </w:r>
-      <w:proofErr w:type="spellEnd"/>
-      <w:r>
-        <w:rPr>
-          <w:color w:val="auto"/>
-        </w:rPr>
-        <w:t>.</w:t>
+        <w:t>Giải thích quy ước chỉ số trong ngôn ngữ đã chọn.</w:t>
       </w:r>
     </w:p>
     <w:p>
@@ -2472,14 +1064,12 @@
           <w:lang w:val="vi-VN"/>
         </w:rPr>
       </w:pPr>
-      <w:proofErr w:type="spellStart"/>
       <w:r>
         <w:rPr>
           <w:color w:val="auto"/>
         </w:rPr>
         <w:t>không</w:t>
       </w:r>
-      <w:proofErr w:type="spellEnd"/>
       <w:r>
         <w:rPr>
           <w:color w:val="auto"/>
@@ -2500,23 +1090,7 @@
           <w:color w:val="auto"/>
           <w:lang w:val="vi-VN"/>
         </w:rPr>
-        <w:t xml:space="preserve">phần tử ban đầu nằm ở vị trí: </w:t>
-      </w:r>
-      <w:proofErr w:type="spellStart"/>
-      <w:r>
-        <w:rPr>
-          <w:color w:val="auto"/>
-          <w:lang w:val="vi-VN"/>
-        </w:rPr>
-        <w:t>q.dau</w:t>
-      </w:r>
-      <w:proofErr w:type="spellEnd"/>
-      <w:r>
-        <w:rPr>
-          <w:color w:val="auto"/>
-          <w:lang w:val="vi-VN"/>
-        </w:rPr>
-        <w:t xml:space="preserve"> chứ không cố định </w:t>
+        <w:t xml:space="preserve">phần tử ban đầu nằm ở vị trí: q.dau chứ không cố định </w:t>
       </w:r>
     </w:p>
     <w:p>
@@ -2531,17 +1105,8 @@
           <w:color w:val="auto"/>
           <w:lang w:val="vi-VN"/>
         </w:rPr>
-        <w:t xml:space="preserve">ngôn ngữ đã chọn: </w:t>
+        <w:t>ngôn ngữ đã chọn: python</w:t>
       </w:r>
-      <w:proofErr w:type="spellStart"/>
-      <w:r>
-        <w:rPr>
-          <w:color w:val="auto"/>
-          <w:lang w:val="vi-VN"/>
-        </w:rPr>
-        <w:t>python</w:t>
-      </w:r>
-      <w:proofErr w:type="spellEnd"/>
     </w:p>
     <w:p>
       <w:pPr>
@@ -2555,23 +1120,7 @@
           <w:color w:val="auto"/>
           <w:lang w:val="vi-VN"/>
         </w:rPr>
-        <w:t xml:space="preserve">quy ước: </w:t>
-      </w:r>
-      <w:proofErr w:type="spellStart"/>
-      <w:r>
-        <w:rPr>
-          <w:color w:val="auto"/>
-          <w:lang w:val="vi-VN"/>
-        </w:rPr>
-        <w:t>mảnng</w:t>
-      </w:r>
-      <w:proofErr w:type="spellEnd"/>
-      <w:r>
-        <w:rPr>
-          <w:color w:val="auto"/>
-          <w:lang w:val="vi-VN"/>
-        </w:rPr>
-        <w:t xml:space="preserve"> được bắt đầu từ 0, vị trí phần tử thứ i tính theo công thức quay đầu </w:t>
+        <w:t xml:space="preserve">quy ước: mảnng được bắt đầu từ 0, vị trí phần tử thứ i tính theo công thức quay đầu </w:t>
       </w:r>
     </w:p>
     <w:p>
@@ -2612,70 +1161,12 @@
           <w:color w:val="auto"/>
         </w:rPr>
       </w:pPr>
-      <w:proofErr w:type="spellStart"/>
       <w:r>
         <w:rPr>
           <w:color w:val="auto"/>
         </w:rPr>
-        <w:t>Kiểm</w:t>
+        <w:t>Kiểm thử và minh chứng</w:t>
       </w:r>
-      <w:proofErr w:type="spellEnd"/>
-      <w:r>
-        <w:rPr>
-          <w:color w:val="auto"/>
-        </w:rPr>
-        <w:t xml:space="preserve"> </w:t>
-      </w:r>
-      <w:proofErr w:type="spellStart"/>
-      <w:r>
-        <w:rPr>
-          <w:color w:val="auto"/>
-        </w:rPr>
-        <w:t>thử</w:t>
-      </w:r>
-      <w:proofErr w:type="spellEnd"/>
-      <w:r>
-        <w:rPr>
-          <w:color w:val="auto"/>
-        </w:rPr>
-        <w:t xml:space="preserve"> </w:t>
-      </w:r>
-      <w:proofErr w:type="spellStart"/>
-      <w:r>
-        <w:rPr>
-          <w:color w:val="auto"/>
-        </w:rPr>
-        <w:t>và</w:t>
-      </w:r>
-      <w:proofErr w:type="spellEnd"/>
-      <w:r>
-        <w:rPr>
-          <w:color w:val="auto"/>
-        </w:rPr>
-        <w:t xml:space="preserve"> </w:t>
-      </w:r>
-      <w:proofErr w:type="spellStart"/>
-      <w:r>
-        <w:rPr>
-          <w:color w:val="auto"/>
-        </w:rPr>
-        <w:t>minh</w:t>
-      </w:r>
-      <w:proofErr w:type="spellEnd"/>
-      <w:r>
-        <w:rPr>
-          <w:color w:val="auto"/>
-        </w:rPr>
-        <w:t xml:space="preserve"> </w:t>
-      </w:r>
-      <w:proofErr w:type="spellStart"/>
-      <w:r>
-        <w:rPr>
-          <w:color w:val="auto"/>
-        </w:rPr>
-        <w:t>chứng</w:t>
-      </w:r>
-      <w:proofErr w:type="spellEnd"/>
     </w:p>
     <w:p>
       <w:pPr>
@@ -2683,425 +1174,11 @@
           <w:color w:val="auto"/>
         </w:rPr>
       </w:pPr>
-      <w:proofErr w:type="spellStart"/>
       <w:r>
         <w:rPr>
           <w:color w:val="auto"/>
         </w:rPr>
-        <w:t>Điền</w:t>
-      </w:r>
-      <w:proofErr w:type="spellEnd"/>
-      <w:r>
-        <w:rPr>
-          <w:color w:val="auto"/>
-        </w:rPr>
-        <w:t xml:space="preserve"> </w:t>
-      </w:r>
-      <w:proofErr w:type="spellStart"/>
-      <w:r>
-        <w:rPr>
-          <w:color w:val="auto"/>
-        </w:rPr>
-        <w:t>kết</w:t>
-      </w:r>
-      <w:proofErr w:type="spellEnd"/>
-      <w:r>
-        <w:rPr>
-          <w:color w:val="auto"/>
-        </w:rPr>
-        <w:t xml:space="preserve"> </w:t>
-      </w:r>
-      <w:proofErr w:type="spellStart"/>
-      <w:r>
-        <w:rPr>
-          <w:color w:val="auto"/>
-        </w:rPr>
-        <w:t>quả</w:t>
-      </w:r>
-      <w:proofErr w:type="spellEnd"/>
-      <w:r>
-        <w:rPr>
-          <w:color w:val="auto"/>
-        </w:rPr>
-        <w:t xml:space="preserve"> </w:t>
-      </w:r>
-      <w:proofErr w:type="spellStart"/>
-      <w:r>
-        <w:rPr>
-          <w:color w:val="auto"/>
-        </w:rPr>
-        <w:t>chạy</w:t>
-      </w:r>
-      <w:proofErr w:type="spellEnd"/>
-      <w:r>
-        <w:rPr>
-          <w:color w:val="auto"/>
-        </w:rPr>
-        <w:t xml:space="preserve"> </w:t>
-      </w:r>
-      <w:proofErr w:type="spellStart"/>
-      <w:r>
-        <w:rPr>
-          <w:color w:val="auto"/>
-        </w:rPr>
-        <w:t>thật</w:t>
-      </w:r>
-      <w:proofErr w:type="spellEnd"/>
-      <w:r>
-        <w:rPr>
-          <w:color w:val="auto"/>
-        </w:rPr>
-        <w:t xml:space="preserve">; </w:t>
-      </w:r>
-      <w:proofErr w:type="spellStart"/>
-      <w:r>
-        <w:rPr>
-          <w:color w:val="auto"/>
-        </w:rPr>
-        <w:t>đầu</w:t>
-      </w:r>
-      <w:proofErr w:type="spellEnd"/>
-      <w:r>
-        <w:rPr>
-          <w:color w:val="auto"/>
-        </w:rPr>
-        <w:t xml:space="preserve"> </w:t>
-      </w:r>
-      <w:proofErr w:type="spellStart"/>
-      <w:r>
-        <w:rPr>
-          <w:color w:val="auto"/>
-        </w:rPr>
-        <w:t>vào</w:t>
-      </w:r>
-      <w:proofErr w:type="spellEnd"/>
-      <w:r>
-        <w:rPr>
-          <w:color w:val="auto"/>
-        </w:rPr>
-        <w:t xml:space="preserve"> </w:t>
-      </w:r>
-      <w:proofErr w:type="spellStart"/>
-      <w:r>
-        <w:rPr>
-          <w:color w:val="auto"/>
-        </w:rPr>
-        <w:t>và</w:t>
-      </w:r>
-      <w:proofErr w:type="spellEnd"/>
-      <w:r>
-        <w:rPr>
-          <w:color w:val="auto"/>
-        </w:rPr>
-        <w:t xml:space="preserve"> </w:t>
-      </w:r>
-      <w:proofErr w:type="spellStart"/>
-      <w:r>
-        <w:rPr>
-          <w:color w:val="auto"/>
-        </w:rPr>
-        <w:t>kết</w:t>
-      </w:r>
-      <w:proofErr w:type="spellEnd"/>
-      <w:r>
-        <w:rPr>
-          <w:color w:val="auto"/>
-        </w:rPr>
-        <w:t xml:space="preserve"> </w:t>
-      </w:r>
-      <w:proofErr w:type="spellStart"/>
-      <w:r>
-        <w:rPr>
-          <w:color w:val="auto"/>
-        </w:rPr>
-        <w:t>quả</w:t>
-      </w:r>
-      <w:proofErr w:type="spellEnd"/>
-      <w:r>
-        <w:rPr>
-          <w:color w:val="auto"/>
-        </w:rPr>
-        <w:t xml:space="preserve"> </w:t>
-      </w:r>
-      <w:proofErr w:type="spellStart"/>
-      <w:r>
-        <w:rPr>
-          <w:color w:val="auto"/>
-        </w:rPr>
-        <w:t>mong</w:t>
-      </w:r>
-      <w:proofErr w:type="spellEnd"/>
-      <w:r>
-        <w:rPr>
-          <w:color w:val="auto"/>
-        </w:rPr>
-        <w:t xml:space="preserve"> </w:t>
-      </w:r>
-      <w:proofErr w:type="spellStart"/>
-      <w:r>
-        <w:rPr>
-          <w:color w:val="auto"/>
-        </w:rPr>
-        <w:t>đợi</w:t>
-      </w:r>
-      <w:proofErr w:type="spellEnd"/>
-      <w:r>
-        <w:rPr>
-          <w:color w:val="auto"/>
-        </w:rPr>
-        <w:t xml:space="preserve"> T01–T12 </w:t>
-      </w:r>
-      <w:proofErr w:type="spellStart"/>
-      <w:r>
-        <w:rPr>
-          <w:color w:val="auto"/>
-        </w:rPr>
-        <w:t>được</w:t>
-      </w:r>
-      <w:proofErr w:type="spellEnd"/>
-      <w:r>
-        <w:rPr>
-          <w:color w:val="auto"/>
-        </w:rPr>
-        <w:t xml:space="preserve"> </w:t>
-      </w:r>
-      <w:proofErr w:type="spellStart"/>
-      <w:r>
-        <w:rPr>
-          <w:color w:val="auto"/>
-        </w:rPr>
-        <w:t>mô</w:t>
-      </w:r>
-      <w:proofErr w:type="spellEnd"/>
-      <w:r>
-        <w:rPr>
-          <w:color w:val="auto"/>
-        </w:rPr>
-        <w:t xml:space="preserve"> </w:t>
-      </w:r>
-      <w:proofErr w:type="spellStart"/>
-      <w:r>
-        <w:rPr>
-          <w:color w:val="auto"/>
-        </w:rPr>
-        <w:t>tả</w:t>
-      </w:r>
-      <w:proofErr w:type="spellEnd"/>
-      <w:r>
-        <w:rPr>
-          <w:color w:val="auto"/>
-        </w:rPr>
-        <w:t xml:space="preserve"> </w:t>
-      </w:r>
-      <w:proofErr w:type="spellStart"/>
-      <w:r>
-        <w:rPr>
-          <w:color w:val="auto"/>
-        </w:rPr>
-        <w:t>trong</w:t>
-      </w:r>
-      <w:proofErr w:type="spellEnd"/>
-      <w:r>
-        <w:rPr>
-          <w:color w:val="auto"/>
-        </w:rPr>
-        <w:t xml:space="preserve"> </w:t>
-      </w:r>
-      <w:proofErr w:type="spellStart"/>
-      <w:r>
-        <w:rPr>
-          <w:color w:val="auto"/>
-        </w:rPr>
-        <w:t>đề</w:t>
-      </w:r>
-      <w:proofErr w:type="spellEnd"/>
-      <w:r>
-        <w:rPr>
-          <w:color w:val="auto"/>
-        </w:rPr>
-        <w:t xml:space="preserve">. </w:t>
-      </w:r>
-      <w:proofErr w:type="spellStart"/>
-      <w:r>
-        <w:rPr>
-          <w:color w:val="auto"/>
-        </w:rPr>
-        <w:t>Nếu</w:t>
-      </w:r>
-      <w:proofErr w:type="spellEnd"/>
-      <w:r>
-        <w:rPr>
-          <w:color w:val="auto"/>
-        </w:rPr>
-        <w:t xml:space="preserve"> </w:t>
-      </w:r>
-      <w:proofErr w:type="spellStart"/>
-      <w:r>
-        <w:rPr>
-          <w:color w:val="auto"/>
-        </w:rPr>
-        <w:t>lỗi</w:t>
-      </w:r>
-      <w:proofErr w:type="spellEnd"/>
-      <w:r>
-        <w:rPr>
-          <w:color w:val="auto"/>
-        </w:rPr>
-        <w:t xml:space="preserve">, </w:t>
-      </w:r>
-      <w:proofErr w:type="spellStart"/>
-      <w:r>
-        <w:rPr>
-          <w:color w:val="auto"/>
-        </w:rPr>
-        <w:t>ghi</w:t>
-      </w:r>
-      <w:proofErr w:type="spellEnd"/>
-      <w:r>
-        <w:rPr>
-          <w:color w:val="auto"/>
-        </w:rPr>
-        <w:t xml:space="preserve"> </w:t>
-      </w:r>
-      <w:proofErr w:type="spellStart"/>
-      <w:r>
-        <w:rPr>
-          <w:color w:val="auto"/>
-        </w:rPr>
-        <w:t>ngắn</w:t>
-      </w:r>
-      <w:proofErr w:type="spellEnd"/>
-      <w:r>
-        <w:rPr>
-          <w:color w:val="auto"/>
-        </w:rPr>
-        <w:t xml:space="preserve"> </w:t>
-      </w:r>
-      <w:proofErr w:type="spellStart"/>
-      <w:r>
-        <w:rPr>
-          <w:color w:val="auto"/>
-        </w:rPr>
-        <w:t>gọn</w:t>
-      </w:r>
-      <w:proofErr w:type="spellEnd"/>
-      <w:r>
-        <w:rPr>
-          <w:color w:val="auto"/>
-        </w:rPr>
-        <w:t xml:space="preserve"> </w:t>
-      </w:r>
-      <w:proofErr w:type="spellStart"/>
-      <w:r>
-        <w:rPr>
-          <w:color w:val="auto"/>
-        </w:rPr>
-        <w:t>sai</w:t>
-      </w:r>
-      <w:proofErr w:type="spellEnd"/>
-      <w:r>
-        <w:rPr>
-          <w:color w:val="auto"/>
-        </w:rPr>
-        <w:t xml:space="preserve"> </w:t>
-      </w:r>
-      <w:proofErr w:type="spellStart"/>
-      <w:r>
-        <w:rPr>
-          <w:color w:val="auto"/>
-        </w:rPr>
-        <w:t>khác</w:t>
-      </w:r>
-      <w:proofErr w:type="spellEnd"/>
-      <w:r>
-        <w:rPr>
-          <w:color w:val="auto"/>
-        </w:rPr>
-        <w:t xml:space="preserve"> </w:t>
-      </w:r>
-      <w:proofErr w:type="spellStart"/>
-      <w:r>
-        <w:rPr>
-          <w:color w:val="auto"/>
-        </w:rPr>
-        <w:t>thay</w:t>
-      </w:r>
-      <w:proofErr w:type="spellEnd"/>
-      <w:r>
-        <w:rPr>
-          <w:color w:val="auto"/>
-        </w:rPr>
-        <w:t xml:space="preserve"> </w:t>
-      </w:r>
-      <w:proofErr w:type="spellStart"/>
-      <w:r>
-        <w:rPr>
-          <w:color w:val="auto"/>
-        </w:rPr>
-        <w:t>vì</w:t>
-      </w:r>
-      <w:proofErr w:type="spellEnd"/>
-      <w:r>
-        <w:rPr>
-          <w:color w:val="auto"/>
-        </w:rPr>
-        <w:t xml:space="preserve"> </w:t>
-      </w:r>
-      <w:proofErr w:type="spellStart"/>
-      <w:r>
-        <w:rPr>
-          <w:color w:val="auto"/>
-        </w:rPr>
-        <w:t>chỉ</w:t>
-      </w:r>
-      <w:proofErr w:type="spellEnd"/>
-      <w:r>
-        <w:rPr>
-          <w:color w:val="auto"/>
-        </w:rPr>
-        <w:t xml:space="preserve"> </w:t>
-      </w:r>
-      <w:proofErr w:type="spellStart"/>
-      <w:r>
-        <w:rPr>
-          <w:color w:val="auto"/>
-        </w:rPr>
-        <w:t>ghi</w:t>
-      </w:r>
-      <w:proofErr w:type="spellEnd"/>
-      <w:r>
-        <w:rPr>
-          <w:color w:val="auto"/>
-        </w:rPr>
-        <w:t xml:space="preserve"> “</w:t>
-      </w:r>
-      <w:proofErr w:type="spellStart"/>
-      <w:r>
-        <w:rPr>
-          <w:color w:val="auto"/>
-        </w:rPr>
-        <w:t>không</w:t>
-      </w:r>
-      <w:proofErr w:type="spellEnd"/>
-      <w:r>
-        <w:rPr>
-          <w:color w:val="auto"/>
-        </w:rPr>
-        <w:t xml:space="preserve"> </w:t>
-      </w:r>
-      <w:proofErr w:type="spellStart"/>
-      <w:r>
-        <w:rPr>
-          <w:color w:val="auto"/>
-        </w:rPr>
-        <w:t>chạy</w:t>
-      </w:r>
-      <w:proofErr w:type="spellEnd"/>
-      <w:r>
-        <w:rPr>
-          <w:color w:val="auto"/>
-        </w:rPr>
-        <w:t>”.</w:t>
+        <w:t>Điền kết quả chạy thật; đầu vào và kết quả mong đợi T01–T12 được mô tả trong đề. Nếu lỗi, ghi ngắn gọn sai khác thay vì chỉ ghi “không chạy”.</w:t>
       </w:r>
     </w:p>
     <w:tbl>
@@ -3141,7 +1218,6 @@
                 <w:color w:val="auto"/>
               </w:rPr>
             </w:pPr>
-            <w:proofErr w:type="spellStart"/>
             <w:r>
               <w:rPr>
                 <w:b/>
@@ -3150,7 +1226,6 @@
               </w:rPr>
               <w:t>Mã</w:t>
             </w:r>
-            <w:proofErr w:type="spellEnd"/>
           </w:p>
         </w:tc>
         <w:tc>
@@ -3172,106 +1247,14 @@
                 <w:color w:val="auto"/>
               </w:rPr>
             </w:pPr>
-            <w:proofErr w:type="spellStart"/>
             <w:r>
               <w:rPr>
                 <w:b/>
                 <w:color w:val="auto"/>
                 <w:sz w:val="18"/>
               </w:rPr>
-              <w:t>Kết</w:t>
+              <w:t>Kết quả thực tế / sai khác</w:t>
             </w:r>
-            <w:proofErr w:type="spellEnd"/>
-            <w:r>
-              <w:rPr>
-                <w:b/>
-                <w:color w:val="auto"/>
-                <w:sz w:val="18"/>
-              </w:rPr>
-              <w:t xml:space="preserve"> </w:t>
-            </w:r>
-            <w:proofErr w:type="spellStart"/>
-            <w:r>
-              <w:rPr>
-                <w:b/>
-                <w:color w:val="auto"/>
-                <w:sz w:val="18"/>
-              </w:rPr>
-              <w:t>quả</w:t>
-            </w:r>
-            <w:proofErr w:type="spellEnd"/>
-            <w:r>
-              <w:rPr>
-                <w:b/>
-                <w:color w:val="auto"/>
-                <w:sz w:val="18"/>
-              </w:rPr>
-              <w:t xml:space="preserve"> </w:t>
-            </w:r>
-            <w:proofErr w:type="spellStart"/>
-            <w:r>
-              <w:rPr>
-                <w:b/>
-                <w:color w:val="auto"/>
-                <w:sz w:val="18"/>
-              </w:rPr>
-              <w:t>thực</w:t>
-            </w:r>
-            <w:proofErr w:type="spellEnd"/>
-            <w:r>
-              <w:rPr>
-                <w:b/>
-                <w:color w:val="auto"/>
-                <w:sz w:val="18"/>
-              </w:rPr>
-              <w:t xml:space="preserve"> </w:t>
-            </w:r>
-            <w:proofErr w:type="spellStart"/>
-            <w:r>
-              <w:rPr>
-                <w:b/>
-                <w:color w:val="auto"/>
-                <w:sz w:val="18"/>
-              </w:rPr>
-              <w:t>tế</w:t>
-            </w:r>
-            <w:proofErr w:type="spellEnd"/>
-            <w:r>
-              <w:rPr>
-                <w:b/>
-                <w:color w:val="auto"/>
-                <w:sz w:val="18"/>
-              </w:rPr>
-              <w:t xml:space="preserve"> / </w:t>
-            </w:r>
-            <w:proofErr w:type="spellStart"/>
-            <w:r>
-              <w:rPr>
-                <w:b/>
-                <w:color w:val="auto"/>
-                <w:sz w:val="18"/>
-              </w:rPr>
-              <w:t>sai</w:t>
-            </w:r>
-            <w:proofErr w:type="spellEnd"/>
-            <w:r>
-              <w:rPr>
-                <w:b/>
-                <w:color w:val="auto"/>
-                <w:sz w:val="18"/>
-              </w:rPr>
-              <w:t xml:space="preserve"> </w:t>
-            </w:r>
-            <w:proofErr w:type="spellStart"/>
-            <w:r>
-              <w:rPr>
-                <w:b/>
-                <w:color w:val="auto"/>
-                <w:sz w:val="18"/>
-              </w:rPr>
-              <w:t>khác</w:t>
-            </w:r>
-            <w:proofErr w:type="spellEnd"/>
           </w:p>
         </w:tc>
         <w:tc>
@@ -3299,36 +1282,8 @@
                 <w:color w:val="auto"/>
                 <w:sz w:val="18"/>
               </w:rPr>
-              <w:t xml:space="preserve">Đạt / </w:t>
+              <w:t>Đạt / chưa đạt</w:t>
             </w:r>
-            <w:proofErr w:type="spellStart"/>
-            <w:r>
-              <w:rPr>
-                <w:b/>
-                <w:color w:val="auto"/>
-                <w:sz w:val="18"/>
-              </w:rPr>
-              <w:t>chưa</w:t>
-            </w:r>
-            <w:proofErr w:type="spellEnd"/>
-            <w:r>
-              <w:rPr>
-                <w:b/>
-                <w:color w:val="auto"/>
-                <w:sz w:val="18"/>
-              </w:rPr>
-              <w:t xml:space="preserve"> </w:t>
-            </w:r>
-            <w:proofErr w:type="spellStart"/>
-            <w:r>
-              <w:rPr>
-                <w:b/>
-                <w:color w:val="auto"/>
-                <w:sz w:val="18"/>
-              </w:rPr>
-              <w:t>đạt</w:t>
-            </w:r>
-            <w:proofErr w:type="spellEnd"/>
           </w:p>
         </w:tc>
       </w:tr>
@@ -3385,7 +1340,6 @@
                 <w:lang w:val="vi-VN"/>
               </w:rPr>
             </w:pPr>
-            <w:proofErr w:type="spellStart"/>
             <w:r>
               <w:rPr>
                 <w:color w:val="auto"/>
@@ -3393,7 +1347,6 @@
               </w:rPr>
               <w:t>Trả</w:t>
             </w:r>
-            <w:proofErr w:type="spellEnd"/>
             <w:r>
               <w:rPr>
                 <w:color w:val="auto"/>
@@ -3486,7 +1439,6 @@
                 <w:lang w:val="vi-VN"/>
               </w:rPr>
             </w:pPr>
-            <w:proofErr w:type="spellStart"/>
             <w:r>
               <w:rPr>
                 <w:color w:val="auto"/>
@@ -3494,7 +1446,6 @@
               </w:rPr>
               <w:t>Trả</w:t>
             </w:r>
-            <w:proofErr w:type="spellEnd"/>
             <w:r>
               <w:rPr>
                 <w:color w:val="auto"/>
@@ -3587,7 +1538,6 @@
                 <w:lang w:val="vi-VN"/>
               </w:rPr>
             </w:pPr>
-            <w:proofErr w:type="spellStart"/>
             <w:r>
               <w:rPr>
                 <w:color w:val="auto"/>
@@ -3595,7 +1545,6 @@
               </w:rPr>
               <w:t>Trả</w:t>
             </w:r>
-            <w:proofErr w:type="spellEnd"/>
             <w:r>
               <w:rPr>
                 <w:color w:val="auto"/>
@@ -3688,7 +1637,6 @@
                 <w:lang w:val="vi-VN"/>
               </w:rPr>
             </w:pPr>
-            <w:proofErr w:type="spellStart"/>
             <w:r>
               <w:rPr>
                 <w:color w:val="auto"/>
@@ -3696,7 +1644,6 @@
               </w:rPr>
               <w:t>Trả</w:t>
             </w:r>
-            <w:proofErr w:type="spellEnd"/>
             <w:r>
               <w:rPr>
                 <w:color w:val="auto"/>
@@ -3789,7 +1736,6 @@
                 <w:lang w:val="vi-VN"/>
               </w:rPr>
             </w:pPr>
-            <w:proofErr w:type="spellStart"/>
             <w:r>
               <w:rPr>
                 <w:color w:val="auto"/>
@@ -3797,7 +1743,6 @@
               </w:rPr>
               <w:t>Trả</w:t>
             </w:r>
-            <w:proofErr w:type="spellEnd"/>
             <w:r>
               <w:rPr>
                 <w:color w:val="auto"/>
@@ -3890,7 +1835,6 @@
                 <w:lang w:val="vi-VN"/>
               </w:rPr>
             </w:pPr>
-            <w:proofErr w:type="spellStart"/>
             <w:r>
               <w:rPr>
                 <w:color w:val="auto"/>
@@ -3898,32 +1842,13 @@
               </w:rPr>
               <w:t>Trả</w:t>
             </w:r>
-            <w:proofErr w:type="spellEnd"/>
             <w:r>
               <w:rPr>
                 <w:color w:val="auto"/>
                 <w:sz w:val="18"/>
                 <w:lang w:val="vi-VN"/>
               </w:rPr>
-              <w:t xml:space="preserve"> về 0 và danh </w:t>
-            </w:r>
-            <w:proofErr w:type="spellStart"/>
-            <w:r>
-              <w:rPr>
-                <w:color w:val="auto"/>
-                <w:sz w:val="18"/>
-                <w:lang w:val="vi-VN"/>
-              </w:rPr>
-              <w:t>sấch</w:t>
-            </w:r>
-            <w:proofErr w:type="spellEnd"/>
-            <w:r>
-              <w:rPr>
-                <w:color w:val="auto"/>
-                <w:sz w:val="18"/>
-                <w:lang w:val="vi-VN"/>
-              </w:rPr>
-              <w:t xml:space="preserve"> 1, 3 và n không đổi</w:t>
+              <w:t xml:space="preserve"> về 0 và danh sấch 1, 3 và n không đổi</w:t>
             </w:r>
           </w:p>
         </w:tc>
@@ -4009,7 +1934,6 @@
                 <w:lang w:val="vi-VN"/>
               </w:rPr>
             </w:pPr>
-            <w:proofErr w:type="spellStart"/>
             <w:r>
               <w:rPr>
                 <w:color w:val="auto"/>
@@ -4017,32 +1941,13 @@
               </w:rPr>
               <w:t>Trả</w:t>
             </w:r>
-            <w:proofErr w:type="spellEnd"/>
             <w:r>
               <w:rPr>
                 <w:color w:val="auto"/>
                 <w:sz w:val="18"/>
                 <w:lang w:val="vi-VN"/>
               </w:rPr>
-              <w:t xml:space="preserve"> về 20, 30 do em nhầm thứ tự của </w:t>
-            </w:r>
-            <w:proofErr w:type="spellStart"/>
-            <w:r>
-              <w:rPr>
-                <w:color w:val="auto"/>
-                <w:sz w:val="18"/>
-                <w:lang w:val="vi-VN"/>
-              </w:rPr>
-              <w:t>pop</w:t>
-            </w:r>
-            <w:proofErr w:type="spellEnd"/>
-            <w:r>
-              <w:rPr>
-                <w:color w:val="auto"/>
-                <w:sz w:val="18"/>
-                <w:lang w:val="vi-VN"/>
-              </w:rPr>
-              <w:t xml:space="preserve">, </w:t>
+              <w:t xml:space="preserve"> về 20, 30 do em nhầm thứ tự của pop, </w:t>
             </w:r>
             <w:r>
               <w:rPr>
@@ -4137,7 +2042,6 @@
                 <w:lang w:val="vi-VN"/>
               </w:rPr>
             </w:pPr>
-            <w:proofErr w:type="spellStart"/>
             <w:r>
               <w:rPr>
                 <w:color w:val="auto"/>
@@ -4145,7 +2049,6 @@
               </w:rPr>
               <w:t>Ngăn</w:t>
             </w:r>
-            <w:proofErr w:type="spellEnd"/>
             <w:r>
               <w:rPr>
                 <w:color w:val="auto"/>
@@ -4251,25 +2154,7 @@
                 <w:sz w:val="18"/>
                 <w:lang w:val="vi-VN"/>
               </w:rPr>
-              <w:t xml:space="preserve"> lỗi </w:t>
-            </w:r>
-            <w:proofErr w:type="spellStart"/>
-            <w:r>
-              <w:rPr>
-                <w:color w:val="auto"/>
-                <w:sz w:val="18"/>
-                <w:lang w:val="vi-VN"/>
-              </w:rPr>
-              <w:t>ValueError</w:t>
-            </w:r>
-            <w:proofErr w:type="spellEnd"/>
-            <w:r>
-              <w:rPr>
-                <w:color w:val="auto"/>
-                <w:sz w:val="18"/>
-                <w:lang w:val="vi-VN"/>
-              </w:rPr>
-              <w:t xml:space="preserve">, ngắn xếp giữ nguyên </w:t>
+              <w:t xml:space="preserve"> lỗi ValueError, ngắn xếp giữ nguyên </w:t>
             </w:r>
           </w:p>
         </w:tc>
@@ -4355,7 +2240,6 @@
                 <w:lang w:val="vi-VN"/>
               </w:rPr>
             </w:pPr>
-            <w:proofErr w:type="spellStart"/>
             <w:r>
               <w:rPr>
                 <w:color w:val="auto"/>
@@ -4363,32 +2247,13 @@
               </w:rPr>
               <w:t>Trả</w:t>
             </w:r>
-            <w:proofErr w:type="spellEnd"/>
             <w:r>
               <w:rPr>
                 <w:color w:val="auto"/>
                 <w:sz w:val="18"/>
                 <w:lang w:val="vi-VN"/>
               </w:rPr>
-              <w:t xml:space="preserve"> về 3, 4, 5 mảng 5, 6, 3, 4, </w:t>
-            </w:r>
-            <w:proofErr w:type="spellStart"/>
-            <w:r>
-              <w:rPr>
-                <w:color w:val="auto"/>
-                <w:sz w:val="18"/>
-                <w:lang w:val="vi-VN"/>
-              </w:rPr>
-              <w:t>dau</w:t>
-            </w:r>
-            <w:proofErr w:type="spellEnd"/>
-            <w:r>
-              <w:rPr>
-                <w:color w:val="auto"/>
-                <w:sz w:val="18"/>
-                <w:lang w:val="vi-VN"/>
-              </w:rPr>
-              <w:t xml:space="preserve"> = 2, so = 4, n = 4 không đổi </w:t>
+              <w:t xml:space="preserve"> về 3, 4, 5 mảng 5, 6, 3, 4, dau = 2, so = 4, n = 4 không đổi </w:t>
             </w:r>
           </w:p>
         </w:tc>
@@ -4474,7 +2339,6 @@
                 <w:lang w:val="vi-VN"/>
               </w:rPr>
             </w:pPr>
-            <w:proofErr w:type="spellStart"/>
             <w:r>
               <w:rPr>
                 <w:color w:val="auto"/>
@@ -4482,7 +2346,6 @@
               </w:rPr>
               <w:t>Toàn</w:t>
             </w:r>
-            <w:proofErr w:type="spellEnd"/>
             <w:r>
               <w:rPr>
                 <w:color w:val="auto"/>
@@ -4641,63 +2504,7 @@
         <w:rPr>
           <w:color w:val="auto"/>
         </w:rPr>
-        <w:t xml:space="preserve">4. Hai </w:t>
-      </w:r>
-      <w:proofErr w:type="spellStart"/>
-      <w:r>
-        <w:rPr>
-          <w:color w:val="auto"/>
-        </w:rPr>
-        <w:t>kiểm</w:t>
-      </w:r>
-      <w:proofErr w:type="spellEnd"/>
-      <w:r>
-        <w:rPr>
-          <w:color w:val="auto"/>
-        </w:rPr>
-        <w:t xml:space="preserve"> </w:t>
-      </w:r>
-      <w:proofErr w:type="spellStart"/>
-      <w:r>
-        <w:rPr>
-          <w:color w:val="auto"/>
-        </w:rPr>
-        <w:t>thử</w:t>
-      </w:r>
-      <w:proofErr w:type="spellEnd"/>
-      <w:r>
-        <w:rPr>
-          <w:color w:val="auto"/>
-        </w:rPr>
-        <w:t xml:space="preserve"> </w:t>
-      </w:r>
-      <w:proofErr w:type="spellStart"/>
-      <w:r>
-        <w:rPr>
-          <w:color w:val="auto"/>
-        </w:rPr>
-        <w:t>tự</w:t>
-      </w:r>
-      <w:proofErr w:type="spellEnd"/>
-      <w:r>
-        <w:rPr>
-          <w:color w:val="auto"/>
-        </w:rPr>
-        <w:t xml:space="preserve"> </w:t>
-      </w:r>
-      <w:proofErr w:type="spellStart"/>
-      <w:r>
-        <w:rPr>
-          <w:color w:val="auto"/>
-        </w:rPr>
-        <w:t>bổ</w:t>
-      </w:r>
-      <w:proofErr w:type="spellEnd"/>
-      <w:r>
-        <w:rPr>
-          <w:color w:val="auto"/>
-        </w:rPr>
-        <w:t xml:space="preserve"> sung</w:t>
+        <w:t>4. Hai kiểm thử tự bổ sung</w:t>
       </w:r>
     </w:p>
     <w:p>
@@ -4711,196 +2518,53 @@
         <w:rPr>
           <w:color w:val="auto"/>
         </w:rPr>
-        <w:t xml:space="preserve">T13: </w:t>
+        <w:t xml:space="preserve">T13: Đầu vào: </w:t>
       </w:r>
-      <w:proofErr w:type="spellStart"/>
-      <w:r>
-        <w:rPr>
-          <w:color w:val="auto"/>
-        </w:rPr>
-        <w:t>Đầu</w:t>
-      </w:r>
-      <w:proofErr w:type="spellEnd"/>
-      <w:r>
-        <w:rPr>
-          <w:color w:val="auto"/>
-        </w:rPr>
-        <w:t xml:space="preserve"> </w:t>
-      </w:r>
-      <w:proofErr w:type="spellStart"/>
-      <w:r>
-        <w:rPr>
-          <w:color w:val="auto"/>
-        </w:rPr>
-        <w:t>vào</w:t>
-      </w:r>
-      <w:proofErr w:type="spellEnd"/>
-      <w:r>
-        <w:rPr>
-          <w:color w:val="auto"/>
-        </w:rPr>
-        <w:t xml:space="preserve">: </w:t>
-      </w:r>
-      <w:proofErr w:type="spellStart"/>
       <w:r>
         <w:rPr>
           <w:color w:val="auto"/>
         </w:rPr>
         <w:t>ngăn</w:t>
       </w:r>
-      <w:proofErr w:type="spellEnd"/>
       <w:r>
         <w:rPr>
           <w:color w:val="auto"/>
           <w:lang w:val="vi-VN"/>
         </w:rPr>
-        <w:t xml:space="preserve"> xếp 10, 20 k = </w:t>
+        <w:t xml:space="preserve"> xếp 10, 20 k = true </w:t>
       </w:r>
-      <w:proofErr w:type="spellStart"/>
-      <w:r>
-        <w:rPr>
-          <w:color w:val="auto"/>
-          <w:lang w:val="vi-VN"/>
-        </w:rPr>
-        <w:t>true</w:t>
-      </w:r>
-      <w:proofErr w:type="spellEnd"/>
-      <w:r>
-        <w:rPr>
-          <w:color w:val="auto"/>
-          <w:lang w:val="vi-VN"/>
-        </w:rPr>
-        <w:t xml:space="preserve"> </w:t>
-      </w:r>
-      <w:proofErr w:type="spellStart"/>
       <w:r>
         <w:rPr>
           <w:color w:val="auto"/>
         </w:rPr>
-        <w:t>Mong</w:t>
+        <w:t xml:space="preserve">Mong đợi: </w:t>
       </w:r>
-      <w:proofErr w:type="spellEnd"/>
-      <w:r>
-        <w:rPr>
-          <w:color w:val="auto"/>
-        </w:rPr>
-        <w:t xml:space="preserve"> </w:t>
-      </w:r>
-      <w:proofErr w:type="spellStart"/>
-      <w:r>
-        <w:rPr>
-          <w:color w:val="auto"/>
-        </w:rPr>
-        <w:t>đợi</w:t>
-      </w:r>
-      <w:proofErr w:type="spellEnd"/>
-      <w:r>
-        <w:rPr>
-          <w:color w:val="auto"/>
-        </w:rPr>
-        <w:t xml:space="preserve">: </w:t>
-      </w:r>
-      <w:proofErr w:type="spellStart"/>
       <w:r>
         <w:rPr>
           <w:color w:val="auto"/>
         </w:rPr>
         <w:t>báo</w:t>
       </w:r>
-      <w:proofErr w:type="spellEnd"/>
       <w:r>
         <w:rPr>
           <w:color w:val="auto"/>
           <w:lang w:val="vi-VN"/>
         </w:rPr>
-        <w:t xml:space="preserve"> lỗi do k không được nhận kiểu </w:t>
-      </w:r>
-      <w:proofErr w:type="spellStart"/>
-      <w:r>
-        <w:rPr>
-          <w:color w:val="auto"/>
-          <w:lang w:val="vi-VN"/>
-        </w:rPr>
-        <w:t>bool</w:t>
-      </w:r>
-      <w:proofErr w:type="spellEnd"/>
-      <w:r>
-        <w:rPr>
-          <w:color w:val="auto"/>
-          <w:lang w:val="vi-VN"/>
-        </w:rPr>
-        <w:t xml:space="preserve"> </w:t>
+        <w:t xml:space="preserve"> lỗi do k không được nhận kiểu bool </w:t>
       </w:r>
       <w:r>
         <w:rPr>
           <w:color w:val="auto"/>
         </w:rPr>
         <w:br/>
+        <w:t xml:space="preserve">Kết quả thực tế: </w:t>
       </w:r>
-      <w:proofErr w:type="spellStart"/>
-      <w:r>
-        <w:rPr>
-          <w:color w:val="auto"/>
-        </w:rPr>
-        <w:t>Kết</w:t>
-      </w:r>
-      <w:proofErr w:type="spellEnd"/>
-      <w:r>
-        <w:rPr>
-          <w:color w:val="auto"/>
-        </w:rPr>
-        <w:t xml:space="preserve"> </w:t>
-      </w:r>
-      <w:proofErr w:type="spellStart"/>
-      <w:r>
-        <w:rPr>
-          <w:color w:val="auto"/>
-        </w:rPr>
-        <w:t>quả</w:t>
-      </w:r>
-      <w:proofErr w:type="spellEnd"/>
-      <w:r>
-        <w:rPr>
-          <w:color w:val="auto"/>
-        </w:rPr>
-        <w:t xml:space="preserve"> </w:t>
-      </w:r>
-      <w:proofErr w:type="spellStart"/>
-      <w:r>
-        <w:rPr>
-          <w:color w:val="auto"/>
-        </w:rPr>
-        <w:t>thực</w:t>
-      </w:r>
-      <w:proofErr w:type="spellEnd"/>
-      <w:r>
-        <w:rPr>
-          <w:color w:val="auto"/>
-        </w:rPr>
-        <w:t xml:space="preserve"> </w:t>
-      </w:r>
-      <w:proofErr w:type="spellStart"/>
-      <w:r>
-        <w:rPr>
-          <w:color w:val="auto"/>
-        </w:rPr>
-        <w:t>tế</w:t>
-      </w:r>
-      <w:proofErr w:type="spellEnd"/>
-      <w:r>
-        <w:rPr>
-          <w:color w:val="auto"/>
-        </w:rPr>
-        <w:t xml:space="preserve">: </w:t>
-      </w:r>
-      <w:proofErr w:type="spellStart"/>
       <w:r>
         <w:rPr>
           <w:color w:val="auto"/>
         </w:rPr>
         <w:t>báo</w:t>
       </w:r>
-      <w:proofErr w:type="spellEnd"/>
       <w:r>
         <w:rPr>
           <w:color w:val="auto"/>
@@ -4912,72 +2576,14 @@
         <w:rPr>
           <w:color w:val="auto"/>
         </w:rPr>
-        <w:t xml:space="preserve">Lý do </w:t>
+        <w:t xml:space="preserve">Lý do chọn tình huống này: </w:t>
       </w:r>
-      <w:proofErr w:type="spellStart"/>
-      <w:r>
-        <w:rPr>
-          <w:color w:val="auto"/>
-        </w:rPr>
-        <w:t>chọn</w:t>
-      </w:r>
-      <w:proofErr w:type="spellEnd"/>
-      <w:r>
-        <w:rPr>
-          <w:color w:val="auto"/>
-        </w:rPr>
-        <w:t xml:space="preserve"> </w:t>
-      </w:r>
-      <w:proofErr w:type="spellStart"/>
-      <w:r>
-        <w:rPr>
-          <w:color w:val="auto"/>
-        </w:rPr>
-        <w:t>tình</w:t>
-      </w:r>
-      <w:proofErr w:type="spellEnd"/>
-      <w:r>
-        <w:rPr>
-          <w:color w:val="auto"/>
-        </w:rPr>
-        <w:t xml:space="preserve"> </w:t>
-      </w:r>
-      <w:proofErr w:type="spellStart"/>
-      <w:r>
-        <w:rPr>
-          <w:color w:val="auto"/>
-        </w:rPr>
-        <w:t>huống</w:t>
-      </w:r>
-      <w:proofErr w:type="spellEnd"/>
-      <w:r>
-        <w:rPr>
-          <w:color w:val="auto"/>
-        </w:rPr>
-        <w:t xml:space="preserve"> </w:t>
-      </w:r>
-      <w:proofErr w:type="spellStart"/>
-      <w:r>
-        <w:rPr>
-          <w:color w:val="auto"/>
-        </w:rPr>
-        <w:t>này</w:t>
-      </w:r>
-      <w:proofErr w:type="spellEnd"/>
-      <w:r>
-        <w:rPr>
-          <w:color w:val="auto"/>
-        </w:rPr>
-        <w:t xml:space="preserve">: </w:t>
-      </w:r>
-      <w:proofErr w:type="spellStart"/>
       <w:r>
         <w:rPr>
           <w:color w:val="auto"/>
         </w:rPr>
         <w:t>kiểu</w:t>
       </w:r>
-      <w:proofErr w:type="spellEnd"/>
       <w:r>
         <w:rPr>
           <w:color w:val="auto"/>
@@ -5034,23 +2640,7 @@
           <w:color w:val="auto"/>
           <w:lang w:val="vi-VN"/>
         </w:rPr>
-        <w:t xml:space="preserve">trạng thái hàng không thay đổi và trả về danh </w:t>
-      </w:r>
-      <w:proofErr w:type="spellStart"/>
-      <w:r>
-        <w:rPr>
-          <w:color w:val="auto"/>
-          <w:lang w:val="vi-VN"/>
-        </w:rPr>
-        <w:t>sấch</w:t>
-      </w:r>
-      <w:proofErr w:type="spellEnd"/>
-      <w:r>
-        <w:rPr>
-          <w:color w:val="auto"/>
-          <w:lang w:val="vi-VN"/>
-        </w:rPr>
-        <w:t xml:space="preserve"> rỗng</w:t>
+        <w:t>trạng thái hàng không thay đổi và trả về danh sấch rỗng</w:t>
       </w:r>
       <w:r>
         <w:rPr>
@@ -5118,23 +2708,7 @@
           <w:color w:val="auto"/>
           <w:lang w:val="vi-VN"/>
         </w:rPr>
-        <w:t xml:space="preserve">Tệp </w:t>
-      </w:r>
-      <w:proofErr w:type="spellStart"/>
-      <w:r>
-        <w:rPr>
-          <w:color w:val="auto"/>
-          <w:lang w:val="vi-VN"/>
-        </w:rPr>
-        <w:t>log</w:t>
-      </w:r>
-      <w:proofErr w:type="spellEnd"/>
-      <w:r>
-        <w:rPr>
-          <w:color w:val="auto"/>
-          <w:lang w:val="vi-VN"/>
-        </w:rPr>
-        <w:t xml:space="preserve"> kiểm thử: </w:t>
+        <w:t xml:space="preserve">Tệp log kiểm thử: </w:t>
       </w:r>
       <w:r>
         <w:rPr>
@@ -5157,7 +2731,6 @@
         </w:rPr>
         <w:t xml:space="preserve">Tệp nhật ký/ảnh giao diện: </w:t>
       </w:r>
-      <w:proofErr w:type="spellStart"/>
       <w:r>
         <w:rPr>
           <w:color w:val="auto"/>
@@ -5165,7 +2738,6 @@
         </w:rPr>
         <w:t>giao_dien_test</w:t>
       </w:r>
-      <w:proofErr w:type="spellEnd"/>
     </w:p>
     <w:p>
       <w:pPr>
@@ -5200,39 +2772,7 @@
           <w:color w:val="auto"/>
           <w:lang w:val="vi-VN"/>
         </w:rPr>
-        <w:t xml:space="preserve"> hàm </w:t>
-      </w:r>
-      <w:proofErr w:type="spellStart"/>
-      <w:r>
-        <w:rPr>
-          <w:color w:val="auto"/>
-          <w:lang w:val="vi-VN"/>
-        </w:rPr>
-        <w:t>lay_nhieu</w:t>
-      </w:r>
-      <w:proofErr w:type="spellEnd"/>
-      <w:r>
-        <w:rPr>
-          <w:color w:val="auto"/>
-          <w:lang w:val="vi-VN"/>
-        </w:rPr>
-        <w:t xml:space="preserve"> do từ đầu em không kiểm tra điều kiện của k ở đầu hàng nên sảy ra tình trạng khiên ngăn xếp gặp lỗi lấy dang dở em đã sửa bằng cách thêm điều kiện kiểm tra 0 &lt; = k &lt; = len trước khi gọi lệnh </w:t>
-      </w:r>
-      <w:proofErr w:type="spellStart"/>
-      <w:r>
-        <w:rPr>
-          <w:color w:val="auto"/>
-          <w:lang w:val="vi-VN"/>
-        </w:rPr>
-        <w:t>pop</w:t>
-      </w:r>
-      <w:proofErr w:type="spellEnd"/>
-      <w:r>
-        <w:rPr>
-          <w:color w:val="auto"/>
-          <w:lang w:val="vi-VN"/>
-        </w:rPr>
-        <w:t xml:space="preserve">() </w:t>
+        <w:t xml:space="preserve"> hàm lay_nhieu do từ đầu em không kiểm tra điều kiện của k ở đầu hàng nên sảy ra tình trạng khiên ngăn xếp gặp lỗi lấy dang dở em đã sửa bằng cách thêm điều kiện kiểm tra 0 &lt; = k &lt; = len trước khi gọi lệnh pop() </w:t>
       </w:r>
     </w:p>
     <w:p>
@@ -5261,23 +2801,29 @@
           <w:color w:val="auto"/>
           <w:lang w:val="vi-VN"/>
         </w:rPr>
-        <w:t xml:space="preserve">khung chương trình mẫu chương 5, các </w:t>
+        <w:t xml:space="preserve">khung chương trình mẫu chương 5, các node do thầy cung cấp </w:t>
       </w:r>
-      <w:proofErr w:type="spellStart"/>
+    </w:p>
+    <w:p>
+      <w:pPr>
+        <w:rPr>
+          <w:color w:val="auto"/>
+          <w:lang w:val="vi-VN"/>
+        </w:rPr>
+      </w:pPr>
       <w:r>
         <w:rPr>
           <w:color w:val="auto"/>
           <w:lang w:val="vi-VN"/>
         </w:rPr>
-        <w:t>node</w:t>
+        <w:t xml:space="preserve">Link github của em: </w:t>
       </w:r>
-      <w:proofErr w:type="spellEnd"/>
       <w:r>
         <w:rPr>
           <w:color w:val="auto"/>
           <w:lang w:val="vi-VN"/>
         </w:rPr>
-        <w:t xml:space="preserve"> do thầy cung cấp </w:t>
+        <w:t>https://github.com/quangtruong15072006-star/ctdl-tuan01</w:t>
       </w:r>
     </w:p>
     <w:p>
@@ -5389,61 +2935,8 @@
       <w:pStyle w:val="Chntrang"/>
       <w:jc w:val="right"/>
     </w:pPr>
-    <w:proofErr w:type="spellStart"/>
     <w:r>
-      <w:t>Mẫu</w:t>
-    </w:r>
-    <w:proofErr w:type="spellEnd"/>
-    <w:r>
-      <w:t xml:space="preserve"> </w:t>
-    </w:r>
-    <w:proofErr w:type="spellStart"/>
-    <w:r>
-      <w:t>báo</w:t>
-    </w:r>
-    <w:proofErr w:type="spellEnd"/>
-    <w:r>
-      <w:t xml:space="preserve"> </w:t>
-    </w:r>
-    <w:proofErr w:type="spellStart"/>
-    <w:r>
-      <w:t>cáo</w:t>
-    </w:r>
-    <w:proofErr w:type="spellEnd"/>
-    <w:r>
-      <w:t xml:space="preserve"> </w:t>
-    </w:r>
-    <w:proofErr w:type="spellStart"/>
-    <w:r>
-      <w:t>bài</w:t>
-    </w:r>
-    <w:proofErr w:type="spellEnd"/>
-    <w:r>
-      <w:t xml:space="preserve"> </w:t>
-    </w:r>
-    <w:proofErr w:type="spellStart"/>
-    <w:r>
-      <w:t>tập</w:t>
-    </w:r>
-    <w:proofErr w:type="spellEnd"/>
-    <w:r>
-      <w:t xml:space="preserve"> </w:t>
-    </w:r>
-    <w:proofErr w:type="spellStart"/>
-    <w:r>
-      <w:t>Chương</w:t>
-    </w:r>
-    <w:proofErr w:type="spellEnd"/>
-    <w:r>
-      <w:t xml:space="preserve"> </w:t>
-    </w:r>
-    <w:proofErr w:type="gramStart"/>
-    <w:r>
-      <w:t>5  •</w:t>
-    </w:r>
-    <w:proofErr w:type="gramEnd"/>
-    <w:r>
-      <w:t xml:space="preserve">  </w:t>
+      <w:t xml:space="preserve">Mẫu báo cáo bài tập Chương 5  •  </w:t>
     </w:r>
     <w:r>
       <w:fldChar w:fldCharType="begin"/>
@@ -5499,15 +2992,7 @@
       <w:pStyle w:val="utrang"/>
     </w:pPr>
     <w:r>
-      <w:t xml:space="preserve">CẤU TRÚC DỮ LIỆU VÀ GIẢI </w:t>
-    </w:r>
-    <w:proofErr w:type="gramStart"/>
-    <w:r>
-      <w:t>THUẬT  /</w:t>
-    </w:r>
-    <w:proofErr w:type="gramEnd"/>
-    <w:r>
-      <w:t xml:space="preserve">  CHƯƠNG 5</w:t>
+      <w:t>CẤU TRÚC DỮ LIỆU VÀ GIẢI THUẬT  /  CHƯƠNG 5</w:t>
     </w:r>
   </w:p>
 </w:hdr>

</xml_diff>